<commit_message>
docs: corregir estado SonarCloud, commit EFT y PDF en documentacion final
</commit_message>
<xml_diff>
--- a/docs/EFT/Desarrollo_proyecto_grupo8_EFT.docx
+++ b/docs/EFT/Desarrollo_proyecto_grupo8_EFT.docx
@@ -1,5 +1,428 @@
 
-<file path=word/document.xml><?xml version="1.0" encoding="utf-8"?>
+<file path=customXml\item1.xml><?xml version="1.0" encoding="utf-8"?>
+<?mso-contentType ?>
+<FormTemplates xmlns="http://schemas.microsoft.com/sharepoint/v3/contenttype/forms">
+  <Display>DocumentLibraryForm</Display>
+  <Edit>DocumentLibraryForm</Edit>
+  <New>DocumentLibraryForm</New>
+</FormTemplates>
+</file>
+
+<file path=customXml\item2.xml><?xml version="1.0" encoding="utf-8"?>
+<b:Sources xmlns:b="http://schemas.openxmlformats.org/officeDocument/2006/bibliography" xmlns="http://schemas.openxmlformats.org/officeDocument/2006/bibliography" SelectedStyle="\APASixthEditionOfficeOnline.xsl" StyleName="APA" Version="6"/>
+</file>
+
+<file path=customXml\item3.xml><?xml version="1.0" encoding="utf-8"?>
+<p:properties xmlns:p="http://schemas.microsoft.com/office/2006/metadata/properties" xmlns:xsi="http://www.w3.org/2001/XMLSchema-instance" xmlns:pc="http://schemas.microsoft.com/office/infopath/2007/PartnerControls">
+  <documentManagement>
+    <lcf76f155ced4ddcb4097134ff3c332f xmlns="d0daa353-f819-43d1-badf-ce69fea8800d">
+      <Terms xmlns="http://schemas.microsoft.com/office/infopath/2007/PartnerControls"/>
+    </lcf76f155ced4ddcb4097134ff3c332f>
+    <TaxCatchAll xmlns="edc1eb1c-f9b5-429a-a0ce-702847a0aa2d" xsi:nil="true"/>
+    <Fecha_x0020_de_x0020_creaci_x00f3_n xmlns="d0daa353-f819-43d1-badf-ce69fea8800d" xsi:nil="true"/>
+    <Fechayhora xmlns="d0daa353-f819-43d1-badf-ce69fea8800d" xsi:nil="true"/>
+    <SharedWithUsers xmlns="edc1eb1c-f9b5-429a-a0ce-702847a0aa2d">
+      <UserInfo>
+        <DisplayName/>
+        <AccountId xsi:nil="true"/>
+        <AccountType/>
+      </UserInfo>
+    </SharedWithUsers>
+    <MediaLengthInSeconds xmlns="d0daa353-f819-43d1-badf-ce69fea8800d" xsi:nil="true"/>
+  </documentManagement>
+</p:properties>
+</file>
+
+<file path=customXml\item4.xml><?xml version="1.0" encoding="utf-8"?>
+<ct:contentTypeSchema xmlns:ct="http://schemas.microsoft.com/office/2006/metadata/contentType" xmlns:ma="http://schemas.microsoft.com/office/2006/metadata/properties/metaAttributes" ct:_="" ma:_="" ma:contentTypeName="Documento" ma:contentTypeID="0x01010070BFDEA41A5D8B46AA5DA2E2389CBE4E" ma:contentTypeVersion="19" ma:contentTypeDescription="Crear nuevo documento." ma:contentTypeScope="" ma:versionID="8582924e0409c10a8a1fc1eca5dfbb2e">
+  <xsd:schema xmlns:xsd="http://www.w3.org/2001/XMLSchema" xmlns:xs="http://www.w3.org/2001/XMLSchema" xmlns:p="http://schemas.microsoft.com/office/2006/metadata/properties" xmlns:ns2="d0daa353-f819-43d1-badf-ce69fea8800d" xmlns:ns3="edc1eb1c-f9b5-429a-a0ce-702847a0aa2d" targetNamespace="http://schemas.microsoft.com/office/2006/metadata/properties" ma:root="true" ma:fieldsID="e4d7d6d0f63e48ebe5e4a9f31787ab41" ns2:_="" ns3:_="">
+    <xsd:import namespace="d0daa353-f819-43d1-badf-ce69fea8800d"/>
+    <xsd:import namespace="edc1eb1c-f9b5-429a-a0ce-702847a0aa2d"/>
+    <xsd:element name="properties">
+      <xsd:complexType>
+        <xsd:sequence>
+          <xsd:element name="documentManagement">
+            <xsd:complexType>
+              <xsd:all>
+                <xsd:element ref="ns2:MediaServiceMetadata" minOccurs="0"/>
+                <xsd:element ref="ns2:MediaServiceFastMetadata" minOccurs="0"/>
+                <xsd:element ref="ns2:MediaServiceDateTaken" minOccurs="0"/>
+                <xsd:element ref="ns2:MediaLengthInSeconds" minOccurs="0"/>
+                <xsd:element ref="ns2:MediaServiceAutoTags" minOccurs="0"/>
+                <xsd:element ref="ns2:MediaServiceOCR" minOccurs="0"/>
+                <xsd:element ref="ns2:MediaServiceGenerationTime" minOccurs="0"/>
+                <xsd:element ref="ns2:MediaServiceEventHashCode" minOccurs="0"/>
+                <xsd:element ref="ns3:SharedWithUsers" minOccurs="0"/>
+                <xsd:element ref="ns3:SharedWithDetails" minOccurs="0"/>
+                <xsd:element ref="ns2:MediaServiceAutoKeyPoints" minOccurs="0"/>
+                <xsd:element ref="ns2:MediaServiceKeyPoints" minOccurs="0"/>
+                <xsd:element ref="ns2:Fechayhora" minOccurs="0"/>
+                <xsd:element ref="ns2:Fecha_x0020_de_x0020_creaci_x00f3_n" minOccurs="0"/>
+                <xsd:element ref="ns2:lcf76f155ced4ddcb4097134ff3c332f" minOccurs="0"/>
+                <xsd:element ref="ns3:TaxCatchAll" minOccurs="0"/>
+                <xsd:element ref="ns2:MediaServiceObjectDetectorVersions" minOccurs="0"/>
+                <xsd:element ref="ns2:MediaServiceSearchProperties" minOccurs="0"/>
+              </xsd:all>
+            </xsd:complexType>
+          </xsd:element>
+        </xsd:sequence>
+      </xsd:complexType>
+    </xsd:element>
+  </xsd:schema>
+  <xsd:schema xmlns:xsd="http://www.w3.org/2001/XMLSchema" xmlns:xs="http://www.w3.org/2001/XMLSchema" xmlns:dms="http://schemas.microsoft.com/office/2006/documentManagement/types" xmlns:pc="http://schemas.microsoft.com/office/infopath/2007/PartnerControls" targetNamespace="d0daa353-f819-43d1-badf-ce69fea8800d" elementFormDefault="qualified">
+    <xsd:import namespace="http://schemas.microsoft.com/office/2006/documentManagement/types"/>
+    <xsd:import namespace="http://schemas.microsoft.com/office/infopath/2007/PartnerControls"/>
+    <xsd:element name="MediaServiceMetadata" ma:index="8" nillable="true" ma:displayName="MediaServiceMetadata" ma:hidden="true" ma:internalName="MediaServiceMetadata" ma:readOnly="true">
+      <xsd:simpleType>
+        <xsd:restriction base="dms:Note"/>
+      </xsd:simpleType>
+    </xsd:element>
+    <xsd:element name="MediaServiceFastMetadata" ma:index="9" nillable="true" ma:displayName="MediaServiceFastMetadata" ma:hidden="true" ma:internalName="MediaServiceFastMetadata" ma:readOnly="true">
+      <xsd:simpleType>
+        <xsd:restriction base="dms:Note"/>
+      </xsd:simpleType>
+    </xsd:element>
+    <xsd:element name="MediaServiceDateTaken" ma:index="10" nillable="true" ma:displayName="MediaServiceDateTaken" ma:hidden="true" ma:internalName="MediaServiceDateTaken" ma:readOnly="true">
+      <xsd:simpleType>
+        <xsd:restriction base="dms:Text"/>
+      </xsd:simpleType>
+    </xsd:element>
+    <xsd:element name="MediaLengthInSeconds" ma:index="11" nillable="true" ma:displayName="Length (seconds)" ma:internalName="MediaLengthInSeconds" ma:readOnly="true">
+      <xsd:simpleType>
+        <xsd:restriction base="dms:Unknown"/>
+      </xsd:simpleType>
+    </xsd:element>
+    <xsd:element name="MediaServiceAutoTags" ma:index="12" nillable="true" ma:displayName="Tags" ma:internalName="MediaServiceAutoTags" ma:readOnly="true">
+      <xsd:simpleType>
+        <xsd:restriction base="dms:Text"/>
+      </xsd:simpleType>
+    </xsd:element>
+    <xsd:element name="MediaServiceOCR" ma:index="13" nillable="true" ma:displayName="Extracted Text" ma:internalName="MediaServiceOCR" ma:readOnly="true">
+      <xsd:simpleType>
+        <xsd:restriction base="dms:Note">
+          <xsd:maxLength value="255"/>
+        </xsd:restriction>
+      </xsd:simpleType>
+    </xsd:element>
+    <xsd:element name="MediaServiceGenerationTime" ma:index="14" nillable="true" ma:displayName="MediaServiceGenerationTime" ma:hidden="true" ma:internalName="MediaServiceGenerationTime" ma:readOnly="true">
+      <xsd:simpleType>
+        <xsd:restriction base="dms:Text"/>
+      </xsd:simpleType>
+    </xsd:element>
+    <xsd:element name="MediaServiceEventHashCode" ma:index="15" nillable="true" ma:displayName="MediaServiceEventHashCode" ma:hidden="true" ma:internalName="MediaServiceEventHashCode" ma:readOnly="true">
+      <xsd:simpleType>
+        <xsd:restriction base="dms:Text"/>
+      </xsd:simpleType>
+    </xsd:element>
+    <xsd:element name="MediaServiceAutoKeyPoints" ma:index="18" nillable="true" ma:displayName="MediaServiceAutoKeyPoints" ma:hidden="true" ma:internalName="MediaServiceAutoKeyPoints" ma:readOnly="true">
+      <xsd:simpleType>
+        <xsd:restriction base="dms:Note"/>
+      </xsd:simpleType>
+    </xsd:element>
+    <xsd:element name="MediaServiceKeyPoints" ma:index="19" nillable="true" ma:displayName="KeyPoints" ma:internalName="MediaServiceKeyPoints" ma:readOnly="true">
+      <xsd:simpleType>
+        <xsd:restriction base="dms:Note">
+          <xsd:maxLength value="255"/>
+        </xsd:restriction>
+      </xsd:simpleType>
+    </xsd:element>
+    <xsd:element name="Fechayhora" ma:index="20" nillable="true" ma:displayName="Fecha y hora" ma:format="DateTime" ma:internalName="Fechayhora">
+      <xsd:simpleType>
+        <xsd:restriction base="dms:DateTime"/>
+      </xsd:simpleType>
+    </xsd:element>
+    <xsd:element name="Fecha_x0020_de_x0020_creaci_x00f3_n" ma:index="21" nillable="true" ma:displayName="Fecha de creación" ma:format="DateTime" ma:internalName="Fecha_x0020_de_x0020_creaci_x00f3_n">
+      <xsd:simpleType>
+        <xsd:restriction base="dms:DateTime"/>
+      </xsd:simpleType>
+    </xsd:element>
+    <xsd:element name="lcf76f155ced4ddcb4097134ff3c332f" ma:index="23" nillable="true" ma:taxonomy="true" ma:internalName="lcf76f155ced4ddcb4097134ff3c332f" ma:taxonomyFieldName="MediaServiceImageTags" ma:displayName="Etiquetas de imagen" ma:readOnly="false" ma:fieldId="{5cf76f15-5ced-4ddc-b409-7134ff3c332f}" ma:taxonomyMulti="true" ma:sspId="e2f773bf-f00b-42a6-8b07-050935be226b" ma:termSetId="09814cd3-568e-fe90-9814-8d621ff8fb84" ma:anchorId="fba54fb3-c3e1-fe81-a776-ca4b69148c4d" ma:open="true" ma:isKeyword="false">
+      <xsd:complexType>
+        <xsd:sequence>
+          <xsd:element ref="pc:Terms" minOccurs="0" maxOccurs="1"/>
+        </xsd:sequence>
+      </xsd:complexType>
+    </xsd:element>
+    <xsd:element name="MediaServiceObjectDetectorVersions" ma:index="25" nillable="true" ma:displayName="MediaServiceObjectDetectorVersions" ma:description="" ma:hidden="true" ma:indexed="true" ma:internalName="MediaServiceObjectDetectorVersions" ma:readOnly="true">
+      <xsd:simpleType>
+        <xsd:restriction base="dms:Text"/>
+      </xsd:simpleType>
+    </xsd:element>
+    <xsd:element name="MediaServiceSearchProperties" ma:index="26" nillable="true" ma:displayName="MediaServiceSearchProperties" ma:hidden="true" ma:internalName="MediaServiceSearchProperties" ma:readOnly="true">
+      <xsd:simpleType>
+        <xsd:restriction base="dms:Note"/>
+      </xsd:simpleType>
+    </xsd:element>
+  </xsd:schema>
+  <xsd:schema xmlns:xsd="http://www.w3.org/2001/XMLSchema" xmlns:xs="http://www.w3.org/2001/XMLSchema" xmlns:dms="http://schemas.microsoft.com/office/2006/documentManagement/types" xmlns:pc="http://schemas.microsoft.com/office/infopath/2007/PartnerControls" targetNamespace="edc1eb1c-f9b5-429a-a0ce-702847a0aa2d" elementFormDefault="qualified">
+    <xsd:import namespace="http://schemas.microsoft.com/office/2006/documentManagement/types"/>
+    <xsd:import namespace="http://schemas.microsoft.com/office/infopath/2007/PartnerControls"/>
+    <xsd:element name="SharedWithUsers" ma:index="16" nillable="true" ma:displayName="Compartido con" ma:internalName="SharedWithUsers" ma:readOnly="true">
+      <xsd:complexType>
+        <xsd:complexContent>
+          <xsd:extension base="dms:UserMulti">
+            <xsd:sequence>
+              <xsd:element name="UserInfo" minOccurs="0" maxOccurs="unbounded">
+                <xsd:complexType>
+                  <xsd:sequence>
+                    <xsd:element name="DisplayName" type="xsd:string" minOccurs="0"/>
+                    <xsd:element name="AccountId" type="dms:UserId" minOccurs="0" nillable="true"/>
+                    <xsd:element name="AccountType" type="xsd:string" minOccurs="0"/>
+                  </xsd:sequence>
+                </xsd:complexType>
+              </xsd:element>
+            </xsd:sequence>
+          </xsd:extension>
+        </xsd:complexContent>
+      </xsd:complexType>
+    </xsd:element>
+    <xsd:element name="SharedWithDetails" ma:index="17" nillable="true" ma:displayName="Detalles de uso compartido" ma:internalName="SharedWithDetails" ma:readOnly="true">
+      <xsd:simpleType>
+        <xsd:restriction base="dms:Note">
+          <xsd:maxLength value="255"/>
+        </xsd:restriction>
+      </xsd:simpleType>
+    </xsd:element>
+    <xsd:element name="TaxCatchAll" ma:index="24" nillable="true" ma:displayName="Taxonomy Catch All Column" ma:hidden="true" ma:list="{9beb23f2-04a0-4483-9f40-448d491ccbe9}" ma:internalName="TaxCatchAll" ma:showField="CatchAllData" ma:web="edc1eb1c-f9b5-429a-a0ce-702847a0aa2d">
+      <xsd:complexType>
+        <xsd:complexContent>
+          <xsd:extension base="dms:MultiChoiceLookup">
+            <xsd:sequence>
+              <xsd:element name="Value" type="dms:Lookup" maxOccurs="unbounded" minOccurs="0" nillable="true"/>
+            </xsd:sequence>
+          </xsd:extension>
+        </xsd:complexContent>
+      </xsd:complexType>
+    </xsd:element>
+  </xsd:schema>
+  <xsd:schema xmlns="http://schemas.openxmlformats.org/package/2006/metadata/core-properties" xmlns:xsd="http://www.w3.org/2001/XMLSchema" xmlns:xsi="http://www.w3.org/2001/XMLSchema-instance" xmlns:dc="http://purl.org/dc/elements/1.1/" xmlns:dcterms="http://purl.org/dc/terms/" xmlns:odoc="http://schemas.microsoft.com/internal/obd" targetNamespace="http://schemas.openxmlformats.org/package/2006/metadata/core-properties" elementFormDefault="qualified" attributeFormDefault="unqualified" blockDefault="#all">
+    <xsd:import namespace="http://purl.org/dc/elements/1.1/" schemaLocation="http://dublincore.org/schemas/xmls/qdc/2003/04/02/dc.xsd"/>
+    <xsd:import namespace="http://purl.org/dc/terms/" schemaLocation="http://dublincore.org/schemas/xmls/qdc/2003/04/02/dcterms.xsd"/>
+    <xsd:element name="coreProperties" type="CT_coreProperties"/>
+    <xsd:complexType name="CT_coreProperties">
+      <xsd:all>
+        <xsd:element ref="dc:creator" minOccurs="0" maxOccurs="1"/>
+        <xsd:element ref="dcterms:created" minOccurs="0" maxOccurs="1"/>
+        <xsd:element ref="dc:identifier" minOccurs="0" maxOccurs="1"/>
+        <xsd:element name="contentType" minOccurs="0" maxOccurs="1" type="xsd:string" ma:index="0" ma:displayName="Tipo de contenido"/>
+        <xsd:element ref="dc:title" minOccurs="0" maxOccurs="1" ma:index="4" ma:displayName="Título"/>
+        <xsd:element ref="dc:subject" minOccurs="0" maxOccurs="1"/>
+        <xsd:element ref="dc:description" minOccurs="0" maxOccurs="1"/>
+        <xsd:element name="keywords" minOccurs="0" maxOccurs="1" type="xsd:string"/>
+        <xsd:element ref="dc:language" minOccurs="0" maxOccurs="1"/>
+        <xsd:element name="category" minOccurs="0" maxOccurs="1" type="xsd:string"/>
+        <xsd:element name="version" minOccurs="0" maxOccurs="1" type="xsd:string"/>
+        <xsd:element name="revision" minOccurs="0" maxOccurs="1" type="xsd:string">
+          <xsd:annotation>
+            <xsd:documentation>
+                        This value indicates the number of saves or revisions. The application is responsible for updating this value after each revision.
+                    </xsd:documentation>
+          </xsd:annotation>
+        </xsd:element>
+        <xsd:element name="lastModifiedBy" minOccurs="0" maxOccurs="1" type="xsd:string"/>
+        <xsd:element ref="dcterms:modified" minOccurs="0" maxOccurs="1"/>
+        <xsd:element name="contentStatus" minOccurs="0" maxOccurs="1" type="xsd:string"/>
+      </xsd:all>
+    </xsd:complexType>
+  </xsd:schema>
+  <xs:schema xmlns:pc="http://schemas.microsoft.com/office/infopath/2007/PartnerControls" xmlns:xs="http://www.w3.org/2001/XMLSchema" targetNamespace="http://schemas.microsoft.com/office/infopath/2007/PartnerControls" elementFormDefault="qualified" attributeFormDefault="unqualified">
+    <xs:element name="Person">
+      <xs:complexType>
+        <xs:sequence>
+          <xs:element ref="pc:DisplayName" minOccurs="0"/>
+          <xs:element ref="pc:AccountId" minOccurs="0"/>
+          <xs:element ref="pc:AccountType" minOccurs="0"/>
+        </xs:sequence>
+      </xs:complexType>
+    </xs:element>
+    <xs:element name="DisplayName" type="xs:string"/>
+    <xs:element name="AccountId" type="xs:string"/>
+    <xs:element name="AccountType" type="xs:string"/>
+    <xs:element name="BDCAssociatedEntity">
+      <xs:complexType>
+        <xs:sequence>
+          <xs:element ref="pc:BDCEntity" minOccurs="0" maxOccurs="unbounded"/>
+        </xs:sequence>
+        <xs:attribute ref="pc:EntityNamespace"/>
+        <xs:attribute ref="pc:EntityName"/>
+        <xs:attribute ref="pc:SystemInstanceName"/>
+        <xs:attribute ref="pc:AssociationName"/>
+      </xs:complexType>
+    </xs:element>
+    <xs:attribute name="EntityNamespace" type="xs:string"/>
+    <xs:attribute name="EntityName" type="xs:string"/>
+    <xs:attribute name="SystemInstanceName" type="xs:string"/>
+    <xs:attribute name="AssociationName" type="xs:string"/>
+    <xs:element name="BDCEntity">
+      <xs:complexType>
+        <xs:sequence>
+          <xs:element ref="pc:EntityDisplayName" minOccurs="0"/>
+          <xs:element ref="pc:EntityInstanceReference" minOccurs="0"/>
+          <xs:element ref="pc:EntityId1" minOccurs="0"/>
+          <xs:element ref="pc:EntityId2" minOccurs="0"/>
+          <xs:element ref="pc:EntityId3" minOccurs="0"/>
+          <xs:element ref="pc:EntityId4" minOccurs="0"/>
+          <xs:element ref="pc:EntityId5" minOccurs="0"/>
+        </xs:sequence>
+      </xs:complexType>
+    </xs:element>
+    <xs:element name="EntityDisplayName" type="xs:string"/>
+    <xs:element name="EntityInstanceReference" type="xs:string"/>
+    <xs:element name="EntityId1" type="xs:string"/>
+    <xs:element name="EntityId2" type="xs:string"/>
+    <xs:element name="EntityId3" type="xs:string"/>
+    <xs:element name="EntityId4" type="xs:string"/>
+    <xs:element name="EntityId5" type="xs:string"/>
+    <xs:element name="Terms">
+      <xs:complexType>
+        <xs:sequence>
+          <xs:element ref="pc:TermInfo" minOccurs="0" maxOccurs="unbounded"/>
+        </xs:sequence>
+      </xs:complexType>
+    </xs:element>
+    <xs:element name="TermInfo">
+      <xs:complexType>
+        <xs:sequence>
+          <xs:element ref="pc:TermName" minOccurs="0"/>
+          <xs:element ref="pc:TermId" minOccurs="0"/>
+        </xs:sequence>
+      </xs:complexType>
+    </xs:element>
+    <xs:element name="TermName" type="xs:string"/>
+    <xs:element name="TermId" type="xs:string"/>
+  </xs:schema>
+</ct:contentTypeSchema>
+</file>
+
+<file path=customXml\itemProps1.xml><?xml version="1.0" encoding="utf-8"?>
+<ds:datastoreItem xmlns:ds="http://schemas.openxmlformats.org/officeDocument/2006/customXml" ds:itemID="{58D8DE95-DF74-49C6-8885-90B115E8F94F}">
+  <ds:schemaRefs>
+    <ds:schemaRef ds:uri="http://schemas.microsoft.com/sharepoint/v3/contenttype/forms"/>
+  </ds:schemaRefs>
+</ds:datastoreItem>
+</file>
+
+<file path=customXml\itemProps2.xml><?xml version="1.0" encoding="utf-8"?>
+<ds:datastoreItem xmlns:ds="http://schemas.openxmlformats.org/officeDocument/2006/customXml" ds:itemID="{DEB73F9D-F662-47F0-B1B4-CC4EDF51573A}">
+  <ds:schemaRefs>
+    <ds:schemaRef ds:uri="http://schemas.openxmlformats.org/officeDocument/2006/bibliography"/>
+  </ds:schemaRefs>
+</ds:datastoreItem>
+</file>
+
+<file path=customXml\itemProps3.xml><?xml version="1.0" encoding="utf-8"?>
+<ds:datastoreItem xmlns:ds="http://schemas.openxmlformats.org/officeDocument/2006/customXml" ds:itemID="{C39D5494-1847-4215-BB00-A838605872D2}">
+  <ds:schemaRefs>
+    <ds:schemaRef ds:uri="http://schemas.microsoft.com/office/2006/metadata/properties"/>
+    <ds:schemaRef ds:uri="http://schemas.microsoft.com/office/infopath/2007/PartnerControls"/>
+    <ds:schemaRef ds:uri="d0daa353-f819-43d1-badf-ce69fea8800d"/>
+    <ds:schemaRef ds:uri="edc1eb1c-f9b5-429a-a0ce-702847a0aa2d"/>
+  </ds:schemaRefs>
+</ds:datastoreItem>
+</file>
+
+<file path=customXml\itemProps4.xml><?xml version="1.0" encoding="utf-8"?>
+<ds:datastoreItem xmlns:ds="http://schemas.openxmlformats.org/officeDocument/2006/customXml" ds:itemID="{DCD4F2C9-DDF9-46DF-9B15-9F8705E9936B}">
+  <ds:schemaRefs>
+    <ds:schemaRef ds:uri="http://schemas.microsoft.com/office/2006/metadata/contentType"/>
+    <ds:schemaRef ds:uri="http://schemas.microsoft.com/office/2006/metadata/properties/metaAttributes"/>
+    <ds:schemaRef ds:uri="http://www.w3.org/2001/XMLSchema"/>
+    <ds:schemaRef ds:uri="http://schemas.microsoft.com/office/2006/metadata/properties"/>
+    <ds:schemaRef ds:uri="d0daa353-f819-43d1-badf-ce69fea8800d"/>
+    <ds:schemaRef ds:uri="edc1eb1c-f9b5-429a-a0ce-702847a0aa2d"/>
+    <ds:schemaRef ds:uri="http://schemas.microsoft.com/office/2006/documentManagement/types"/>
+    <ds:schemaRef ds:uri="http://schemas.microsoft.com/office/infopath/2007/PartnerControls"/>
+    <ds:schemaRef ds:uri="http://schemas.openxmlformats.org/package/2006/metadata/core-properties"/>
+    <ds:schemaRef ds:uri="http://purl.org/dc/elements/1.1/"/>
+    <ds:schemaRef ds:uri="http://purl.org/dc/terms/"/>
+    <ds:schemaRef ds:uri="http://schemas.microsoft.com/internal/obd"/>
+  </ds:schemaRefs>
+</ds:datastoreItem>
+</file>
+
+<file path=docProps\app.xml><?xml version="1.0" encoding="utf-8"?>
+<Properties xmlns="http://schemas.openxmlformats.org/officeDocument/2006/extended-properties" xmlns:vt="http://schemas.openxmlformats.org/officeDocument/2006/docPropsVTypes">
+  <Template>Normal.dotm</Template>
+  <TotalTime>20</TotalTime>
+  <Pages>14</Pages>
+  <Words>1809</Words>
+  <Characters>9952</Characters>
+  <Application>Microsoft Office Word</Application>
+  <DocSecurity>0</DocSecurity>
+  <Lines>82</Lines>
+  <Paragraphs>23</Paragraphs>
+  <ScaleCrop>false</ScaleCrop>
+  <HeadingPairs>
+    <vt:vector size="2" baseType="variant">
+      <vt:variant>
+        <vt:lpstr>Título</vt:lpstr>
+      </vt:variant>
+      <vt:variant>
+        <vt:i4>1</vt:i4>
+      </vt:variant>
+    </vt:vector>
+  </HeadingPairs>
+  <TitlesOfParts>
+    <vt:vector size="1" baseType="lpstr">
+      <vt:lpstr/>
+    </vt:vector>
+  </TitlesOfParts>
+  <Company/>
+  <LinksUpToDate>false</LinksUpToDate>
+  <CharactersWithSpaces>11738</CharactersWithSpaces>
+  <SharedDoc>false</SharedDoc>
+  <HyperlinksChanged>false</HyperlinksChanged>
+  <AppVersion>16.0000</AppVersion>
+</Properties>
+</file>
+
+<file path=docProps\core.xml><?xml version="1.0" encoding="utf-8"?>
+<cp:coreProperties xmlns:cp="http://schemas.openxmlformats.org/package/2006/metadata/core-properties" xmlns:dc="http://purl.org/dc/elements/1.1/" xmlns:dcterms="http://purl.org/dc/terms/" xmlns:dcmitype="http://purl.org/dc/dcmitype/" xmlns:xsi="http://www.w3.org/2001/XMLSchema-instance">
+  <dc:title/>
+  <dc:subject/>
+  <dc:creator>Duoc UC Online</dc:creator>
+  <cp:keywords/>
+  <dc:description/>
+  <cp:lastModifiedBy>Maria Jose Medina C.</cp:lastModifiedBy>
+  <cp:revision>8</cp:revision>
+  <dcterms:created xsi:type="dcterms:W3CDTF">2025-03-19T18:04:00Z</dcterms:created>
+  <dcterms:modified xsi:type="dcterms:W3CDTF">2025-03-19T19:31:00Z</dcterms:modified>
+</cp:coreProperties>
+</file>
+
+<file path=docProps\custom.xml><?xml version="1.0" encoding="utf-8"?>
+<Properties xmlns="http://schemas.openxmlformats.org/officeDocument/2006/custom-properties" xmlns:vt="http://schemas.openxmlformats.org/officeDocument/2006/docPropsVTypes">
+  <property fmtid="{D5CDD505-2E9C-101B-9397-08002B2CF9AE}" pid="2" name="ContentTypeId">
+    <vt:lpwstr>0x01010070BFDEA41A5D8B46AA5DA2E2389CBE4E</vt:lpwstr>
+  </property>
+  <property fmtid="{D5CDD505-2E9C-101B-9397-08002B2CF9AE}" pid="3" name="MediaServiceImageTags">
+    <vt:lpwstr/>
+  </property>
+  <property fmtid="{D5CDD505-2E9C-101B-9397-08002B2CF9AE}" pid="4" name="Order">
+    <vt:r8>1635500</vt:r8>
+  </property>
+  <property fmtid="{D5CDD505-2E9C-101B-9397-08002B2CF9AE}" pid="5" name="xd_Signature">
+    <vt:bool>false</vt:bool>
+  </property>
+  <property fmtid="{D5CDD505-2E9C-101B-9397-08002B2CF9AE}" pid="6" name="xd_ProgID">
+    <vt:lpwstr/>
+  </property>
+  <property fmtid="{D5CDD505-2E9C-101B-9397-08002B2CF9AE}" pid="7" name="ComplianceAssetId">
+    <vt:lpwstr/>
+  </property>
+  <property fmtid="{D5CDD505-2E9C-101B-9397-08002B2CF9AE}" pid="8" name="TemplateUrl">
+    <vt:lpwstr/>
+  </property>
+  <property fmtid="{D5CDD505-2E9C-101B-9397-08002B2CF9AE}" pid="9" name="_ExtendedDescription">
+    <vt:lpwstr/>
+  </property>
+  <property fmtid="{D5CDD505-2E9C-101B-9397-08002B2CF9AE}" pid="10" name="TriggerFlowInfo">
+    <vt:lpwstr/>
+  </property>
+</Properties>
+</file>
+
+<file path=word\document.xml><?xml version="1.0" encoding="utf-8"?>
 <w:document xmlns:wpc="http://schemas.microsoft.com/office/word/2010/wordprocessingCanvas" xmlns:cx="http://schemas.microsoft.com/office/drawing/2014/chartex" xmlns:cx1="http://schemas.microsoft.com/office/drawing/2015/9/8/chartex" xmlns:cx2="http://schemas.microsoft.com/office/drawing/2015/10/21/chartex" xmlns:cx3="http://schemas.microsoft.com/office/drawing/2016/5/9/chartex" xmlns:cx4="http://schemas.microsoft.com/office/drawing/2016/5/10/chartex" xmlns:cx5="http://schemas.microsoft.com/office/drawing/2016/5/11/chartex" xmlns:cx6="http://schemas.microsoft.com/office/drawing/2016/5/12/chartex" xmlns:cx7="http://schemas.microsoft.com/office/drawing/2016/5/13/chartex" xmlns:cx8="http://schemas.microsoft.com/office/drawing/2016/5/14/chartex" xmlns:mc="http://schemas.openxmlformats.org/markup-compatibility/2006" xmlns:aink="http://schemas.microsoft.com/office/drawing/2016/ink" xmlns:am3d="http://schemas.microsoft.com/office/drawing/2017/model3d" xmlns:o="urn:schemas-microsoft-com:office:office" xmlns:oel="http://schemas.microsoft.com/office/2019/extlst" xmlns:r="http://schemas.openxmlformats.org/officeDocument/2006/relationships" xmlns:m="http://schemas.openxmlformats.org/officeDocument/2006/math" xmlns:v="urn:schemas-microsoft-com:vml" xmlns:wp14="http://schemas.microsoft.com/office/word/2010/wordprocessingDrawing" xmlns:wp="http://schemas.openxmlformats.org/drawingml/2006/wordprocessingDrawing" xmlns:w10="urn:schemas-microsoft-com:office:word" xmlns:w="http://schemas.openxmlformats.org/wordprocessingml/2006/main" xmlns:w14="http://schemas.microsoft.com/office/word/2010/wordml" xmlns:w15="http://schemas.microsoft.com/office/word/2012/wordml" xmlns:w16cex="http://schemas.microsoft.com/office/word/2018/wordml/cex" xmlns:w16cid="http://schemas.microsoft.com/office/word/2016/wordml/cid" xmlns:w16="http://schemas.microsoft.com/office/word/2018/wordml" xmlns:w16du="http://schemas.microsoft.com/office/word/2023/wordml/word16du" xmlns:w16sdtdh="http://schemas.microsoft.com/office/word/2020/wordml/sdtdatahash" xmlns:w16sdtfl="http://schemas.microsoft.com/office/word/2024/wordml/sdtformatlock" xmlns:w16se="http://schemas.microsoft.com/office/word/2015/wordml/symex" xmlns:wpg="http://schemas.microsoft.com/office/word/2010/wordprocessingGroup" xmlns:wpi="http://schemas.microsoft.com/office/word/2010/wordprocessingInk" xmlns:wne="http://schemas.microsoft.com/office/word/2006/wordml" xmlns:wps="http://schemas.microsoft.com/office/word/2010/wordprocessingShape" mc:Ignorable="w14 w15 w16se w16cid w16 w16cex w16sdtdh w16sdtfl w16du wp14">
   <w:body>
     <w:p>
@@ -5060,7 +5483,7 @@
                 <w:i/>
                 <w:sz w:val="18"/>
               </w:rPr>
-              <w:t>Análisis estático complementario (SonarQube Cloud, rama develop): mantenibilidad A (35 issues); fiabilidad C (13 issues); seguridad E (12 issues); duplicación 13,9 %. Quality Gate no superado por hallazgos de seguridad, fiabilidad y ausencia de importación del reporte Jest. La ausencia de cobertura en SonarQube no refleja ausencia de pruebas: el proyecto cuenta con 99/99 tests Jest aprobados (reporte independiente). Estos hallazgos se registran como deuda técnica posterior al cierre funcional del MVP. Desviaciones / lecciones aprendidas: Cobertura branches (48,12%) y funciones (59,66%) inferior al objetivo inicial de 60% en esas métricas. Documentado como deuda técnica para iteración futura. En próximos proyectos: agregar branch coverage como gate de PR desde la semana 2; integrar importación del reporte de cobertura en el workflow de SonarQube desde la semana 2.</w:t>
+              <w:t>Análisis estático complementario (SonarQube Cloud, rama develop): mantenibilidad A (35 issues); fiabilidad C (13 issues); seguridad E (12 issues); duplicación 13,9 %. Quality Gate superado (rama develop, 2026-07-19). Hallazgos de seguridad, fiabilidad y duplicación en código global permanecen como deuda técnica; la cobertura sin importar no impacta el Gate de código nuevo. La ausencia de cobertura en SonarQube no refleja ausencia de pruebas: el proyecto cuenta con 99/99 tests Jest aprobados (reporte independiente). Estos hallazgos se registran como deuda técnica posterior al cierre funcional del MVP. Desviaciones / lecciones aprendidas: Cobertura branches (48,12%) y funciones (59,66%) inferior al objetivo inicial de 60% en esas métricas. Documentado como deuda técnica para iteración futura. En próximos proyectos: agregar branch coverage como gate de PR desde la semana 2; integrar importación del reporte de cobertura en el workflow de SonarQube desde la semana 2.</w:t>
             </w:r>
           </w:p>
           <w:p>
@@ -10339,7 +10762,7 @@
                 <w:i w:val="0"/>
                 <w:sz w:val="20"/>
               </w:rPr>
-              <w:t>Aulafy_EFT_Grupo8.pptx  •  Aulafy_EFT_Grupo8.pdf (pendiente de exportación)  •  Aulafy_EFT_Grupo8_video.mp4 (pendiente de grabación)</w:t>
+              <w:t>Aulafy_EFT_Grupo8.pptx  •  Aulafy_EFT_Grupo8.pdf  •  Aulafy_EFT_Grupo8_video.mp4 (pendiente de grabación)</w:t>
             </w:r>
           </w:p>
         </w:tc>
@@ -10879,7 +11302,7 @@
                 <w:i/>
                 <w:sz w:val="18"/>
               </w:rPr>
-              <w:t>Rama principal: develop  |  Último commit EFT: a7f7a72 (2026-07-16)  |  72 archivos. Documentación y código disponibles en el repositorio. El cierre definitivo de entregables se realizará después de incorporar la presentación audiovisual.</w:t>
+              <w:t>Rama principal: develop  |  Último commit EFT: 54d4ca0 (2026-07-19)  |  72 archivos. Documentación y código disponibles en el repositorio. El cierre definitivo de entregables se realizará después de incorporar la presentación audiovisual.</w:t>
             </w:r>
           </w:p>
         </w:tc>
@@ -11508,7 +11931,7 @@
 </w:document>
 </file>
 
-<file path=word/endnotes.xml><?xml version="1.0" encoding="utf-8"?>
+<file path=word\endnotes.xml><?xml version="1.0" encoding="utf-8"?>
 <w:endnotes xmlns:wpc="http://schemas.microsoft.com/office/word/2010/wordprocessingCanvas" xmlns:cx="http://schemas.microsoft.com/office/drawing/2014/chartex" xmlns:cx1="http://schemas.microsoft.com/office/drawing/2015/9/8/chartex" xmlns:cx2="http://schemas.microsoft.com/office/drawing/2015/10/21/chartex" xmlns:cx3="http://schemas.microsoft.com/office/drawing/2016/5/9/chartex" xmlns:cx4="http://schemas.microsoft.com/office/drawing/2016/5/10/chartex" xmlns:cx5="http://schemas.microsoft.com/office/drawing/2016/5/11/chartex" xmlns:cx6="http://schemas.microsoft.com/office/drawing/2016/5/12/chartex" xmlns:cx7="http://schemas.microsoft.com/office/drawing/2016/5/13/chartex" xmlns:cx8="http://schemas.microsoft.com/office/drawing/2016/5/14/chartex" xmlns:mc="http://schemas.openxmlformats.org/markup-compatibility/2006" xmlns:aink="http://schemas.microsoft.com/office/drawing/2016/ink" xmlns:am3d="http://schemas.microsoft.com/office/drawing/2017/model3d" xmlns:o="urn:schemas-microsoft-com:office:office" xmlns:oel="http://schemas.microsoft.com/office/2019/extlst" xmlns:r="http://schemas.openxmlformats.org/officeDocument/2006/relationships" xmlns:m="http://schemas.openxmlformats.org/officeDocument/2006/math" xmlns:v="urn:schemas-microsoft-com:vml" xmlns:wp14="http://schemas.microsoft.com/office/word/2010/wordprocessingDrawing" xmlns:wp="http://schemas.openxmlformats.org/drawingml/2006/wordprocessingDrawing" xmlns:w10="urn:schemas-microsoft-com:office:word" xmlns:w="http://schemas.openxmlformats.org/wordprocessingml/2006/main" xmlns:w14="http://schemas.microsoft.com/office/word/2010/wordml" xmlns:w15="http://schemas.microsoft.com/office/word/2012/wordml" xmlns:w16cex="http://schemas.microsoft.com/office/word/2018/wordml/cex" xmlns:w16cid="http://schemas.microsoft.com/office/word/2016/wordml/cid" xmlns:w16="http://schemas.microsoft.com/office/word/2018/wordml" xmlns:w16du="http://schemas.microsoft.com/office/word/2023/wordml/word16du" xmlns:w16sdtdh="http://schemas.microsoft.com/office/word/2020/wordml/sdtdatahash" xmlns:w16sdtfl="http://schemas.microsoft.com/office/word/2024/wordml/sdtformatlock" xmlns:w16se="http://schemas.microsoft.com/office/word/2015/wordml/symex" xmlns:wpg="http://schemas.microsoft.com/office/word/2010/wordprocessingGroup" xmlns:wpi="http://schemas.microsoft.com/office/word/2010/wordprocessingInk" xmlns:wne="http://schemas.microsoft.com/office/word/2006/wordml" xmlns:wps="http://schemas.microsoft.com/office/word/2010/wordprocessingShape" mc:Ignorable="w14 w15 w16se w16cid w16 w16cex w16sdtdh w16sdtfl w16du wp14">
   <w:endnote w:type="separator" w:id="-1">
     <w:p>
@@ -11533,7 +11956,54 @@
 </w:endnotes>
 </file>
 
-<file path=word/footer1.xml><?xml version="1.0" encoding="utf-8"?>
+<file path=word\fontTable.xml><?xml version="1.0" encoding="utf-8"?>
+<w:fonts xmlns:mc="http://schemas.openxmlformats.org/markup-compatibility/2006" xmlns:r="http://schemas.openxmlformats.org/officeDocument/2006/relationships" xmlns:w="http://schemas.openxmlformats.org/wordprocessingml/2006/main" xmlns:w14="http://schemas.microsoft.com/office/word/2010/wordml" xmlns:w15="http://schemas.microsoft.com/office/word/2012/wordml" xmlns:w16cex="http://schemas.microsoft.com/office/word/2018/wordml/cex" xmlns:w16cid="http://schemas.microsoft.com/office/word/2016/wordml/cid" xmlns:w16="http://schemas.microsoft.com/office/word/2018/wordml" xmlns:w16du="http://schemas.microsoft.com/office/word/2023/wordml/word16du" xmlns:w16sdtdh="http://schemas.microsoft.com/office/word/2020/wordml/sdtdatahash" xmlns:w16sdtfl="http://schemas.microsoft.com/office/word/2024/wordml/sdtformatlock" xmlns:w16se="http://schemas.microsoft.com/office/word/2015/wordml/symex" mc:Ignorable="w14 w15 w16se w16cid w16 w16cex w16sdtdh w16sdtfl w16du">
+  <w:font w:name="Symbol">
+    <w:panose1 w:val="05050102010706020507"/>
+    <w:charset w:val="02"/>
+    <w:family w:val="roman"/>
+    <w:pitch w:val="variable"/>
+    <w:sig w:usb0="00000000" w:usb1="10000000" w:usb2="00000000" w:usb3="00000000" w:csb0="80000000" w:csb1="00000000"/>
+  </w:font>
+  <w:font w:name="Times New Roman">
+    <w:panose1 w:val="02020603050405020304"/>
+    <w:charset w:val="00"/>
+    <w:family w:val="roman"/>
+    <w:pitch w:val="variable"/>
+    <w:sig w:usb0="E0002EFF" w:usb1="C000785B" w:usb2="00000009" w:usb3="00000000" w:csb0="000001FF" w:csb1="00000000"/>
+  </w:font>
+  <w:font w:name="Courier New">
+    <w:panose1 w:val="02070309020205020404"/>
+    <w:charset w:val="00"/>
+    <w:family w:val="modern"/>
+    <w:pitch w:val="fixed"/>
+    <w:sig w:usb0="E0002EFF" w:usb1="C0007843" w:usb2="00000009" w:usb3="00000000" w:csb0="000001FF" w:csb1="00000000"/>
+  </w:font>
+  <w:font w:name="Wingdings">
+    <w:panose1 w:val="05000000000000000000"/>
+    <w:charset w:val="02"/>
+    <w:family w:val="auto"/>
+    <w:pitch w:val="variable"/>
+    <w:sig w:usb0="00000000" w:usb1="10000000" w:usb2="00000000" w:usb3="00000000" w:csb0="80000000" w:csb1="00000000"/>
+  </w:font>
+  <w:font w:name="Arial">
+    <w:panose1 w:val="020B0604020202020204"/>
+    <w:charset w:val="00"/>
+    <w:family w:val="swiss"/>
+    <w:pitch w:val="variable"/>
+    <w:sig w:usb0="E0002EFF" w:usb1="C000785B" w:usb2="00000009" w:usb3="00000000" w:csb0="000001FF" w:csb1="00000000"/>
+  </w:font>
+  <w:font w:name="Calibri">
+    <w:panose1 w:val="020F0502020204030204"/>
+    <w:charset w:val="00"/>
+    <w:family w:val="swiss"/>
+    <w:pitch w:val="variable"/>
+    <w:sig w:usb0="E4002EFF" w:usb1="C200247B" w:usb2="00000009" w:usb3="00000000" w:csb0="000001FF" w:csb1="00000000"/>
+  </w:font>
+</w:fonts>
+</file>
+
+<file path=word\footer1.xml><?xml version="1.0" encoding="utf-8"?>
 <w:ftr xmlns:wpc="http://schemas.microsoft.com/office/word/2010/wordprocessingCanvas" xmlns:cx="http://schemas.microsoft.com/office/drawing/2014/chartex" xmlns:cx1="http://schemas.microsoft.com/office/drawing/2015/9/8/chartex" xmlns:cx2="http://schemas.microsoft.com/office/drawing/2015/10/21/chartex" xmlns:cx3="http://schemas.microsoft.com/office/drawing/2016/5/9/chartex" xmlns:cx4="http://schemas.microsoft.com/office/drawing/2016/5/10/chartex" xmlns:cx5="http://schemas.microsoft.com/office/drawing/2016/5/11/chartex" xmlns:cx6="http://schemas.microsoft.com/office/drawing/2016/5/12/chartex" xmlns:cx7="http://schemas.microsoft.com/office/drawing/2016/5/13/chartex" xmlns:cx8="http://schemas.microsoft.com/office/drawing/2016/5/14/chartex" xmlns:mc="http://schemas.openxmlformats.org/markup-compatibility/2006" xmlns:aink="http://schemas.microsoft.com/office/drawing/2016/ink" xmlns:am3d="http://schemas.microsoft.com/office/drawing/2017/model3d" xmlns:o="urn:schemas-microsoft-com:office:office" xmlns:oel="http://schemas.microsoft.com/office/2019/extlst" xmlns:r="http://schemas.openxmlformats.org/officeDocument/2006/relationships" xmlns:m="http://schemas.openxmlformats.org/officeDocument/2006/math" xmlns:v="urn:schemas-microsoft-com:vml" xmlns:wp14="http://schemas.microsoft.com/office/word/2010/wordprocessingDrawing" xmlns:wp="http://schemas.openxmlformats.org/drawingml/2006/wordprocessingDrawing" xmlns:w10="urn:schemas-microsoft-com:office:word" xmlns:w="http://schemas.openxmlformats.org/wordprocessingml/2006/main" xmlns:w14="http://schemas.microsoft.com/office/word/2010/wordml" xmlns:w15="http://schemas.microsoft.com/office/word/2012/wordml" xmlns:w16cex="http://schemas.microsoft.com/office/word/2018/wordml/cex" xmlns:w16cid="http://schemas.microsoft.com/office/word/2016/wordml/cid" xmlns:w16="http://schemas.microsoft.com/office/word/2018/wordml" xmlns:w16du="http://schemas.microsoft.com/office/word/2023/wordml/word16du" xmlns:w16sdtdh="http://schemas.microsoft.com/office/word/2020/wordml/sdtdatahash" xmlns:w16sdtfl="http://schemas.microsoft.com/office/word/2024/wordml/sdtformatlock" xmlns:w16se="http://schemas.microsoft.com/office/word/2015/wordml/symex" xmlns:wpg="http://schemas.microsoft.com/office/word/2010/wordprocessingGroup" xmlns:wpi="http://schemas.microsoft.com/office/word/2010/wordprocessingInk" xmlns:wne="http://schemas.microsoft.com/office/word/2006/wordml" xmlns:wps="http://schemas.microsoft.com/office/word/2010/wordprocessingShape" mc:Ignorable="w14 w15 w16se w16cid w16 w16cex w16sdtdh w16sdtfl w16du wp14">
   <w:p>
     <w:pPr>
@@ -11543,7 +12013,7 @@
 </w:ftr>
 </file>
 
-<file path=word/footnotes.xml><?xml version="1.0" encoding="utf-8"?>
+<file path=word\footnotes.xml><?xml version="1.0" encoding="utf-8"?>
 <w:footnotes xmlns:wpc="http://schemas.microsoft.com/office/word/2010/wordprocessingCanvas" xmlns:cx="http://schemas.microsoft.com/office/drawing/2014/chartex" xmlns:cx1="http://schemas.microsoft.com/office/drawing/2015/9/8/chartex" xmlns:cx2="http://schemas.microsoft.com/office/drawing/2015/10/21/chartex" xmlns:cx3="http://schemas.microsoft.com/office/drawing/2016/5/9/chartex" xmlns:cx4="http://schemas.microsoft.com/office/drawing/2016/5/10/chartex" xmlns:cx5="http://schemas.microsoft.com/office/drawing/2016/5/11/chartex" xmlns:cx6="http://schemas.microsoft.com/office/drawing/2016/5/12/chartex" xmlns:cx7="http://schemas.microsoft.com/office/drawing/2016/5/13/chartex" xmlns:cx8="http://schemas.microsoft.com/office/drawing/2016/5/14/chartex" xmlns:mc="http://schemas.openxmlformats.org/markup-compatibility/2006" xmlns:aink="http://schemas.microsoft.com/office/drawing/2016/ink" xmlns:am3d="http://schemas.microsoft.com/office/drawing/2017/model3d" xmlns:o="urn:schemas-microsoft-com:office:office" xmlns:oel="http://schemas.microsoft.com/office/2019/extlst" xmlns:r="http://schemas.openxmlformats.org/officeDocument/2006/relationships" xmlns:m="http://schemas.openxmlformats.org/officeDocument/2006/math" xmlns:v="urn:schemas-microsoft-com:vml" xmlns:wp14="http://schemas.microsoft.com/office/word/2010/wordprocessingDrawing" xmlns:wp="http://schemas.openxmlformats.org/drawingml/2006/wordprocessingDrawing" xmlns:w10="urn:schemas-microsoft-com:office:word" xmlns:w="http://schemas.openxmlformats.org/wordprocessingml/2006/main" xmlns:w14="http://schemas.microsoft.com/office/word/2010/wordml" xmlns:w15="http://schemas.microsoft.com/office/word/2012/wordml" xmlns:w16cex="http://schemas.microsoft.com/office/word/2018/wordml/cex" xmlns:w16cid="http://schemas.microsoft.com/office/word/2016/wordml/cid" xmlns:w16="http://schemas.microsoft.com/office/word/2018/wordml" xmlns:w16du="http://schemas.microsoft.com/office/word/2023/wordml/word16du" xmlns:w16sdtdh="http://schemas.microsoft.com/office/word/2020/wordml/sdtdatahash" xmlns:w16sdtfl="http://schemas.microsoft.com/office/word/2024/wordml/sdtformatlock" xmlns:w16se="http://schemas.microsoft.com/office/word/2015/wordml/symex" xmlns:wpg="http://schemas.microsoft.com/office/word/2010/wordprocessingGroup" xmlns:wpi="http://schemas.microsoft.com/office/word/2010/wordprocessingInk" xmlns:wne="http://schemas.microsoft.com/office/word/2006/wordml" xmlns:wps="http://schemas.microsoft.com/office/word/2010/wordprocessingShape" mc:Ignorable="w14 w15 w16se w16cid w16 w16cex w16sdtdh w16sdtfl w16du wp14">
   <w:footnote w:type="separator" w:id="-1">
     <w:p>
@@ -11568,7 +12038,7 @@
 </w:footnotes>
 </file>
 
-<file path=word/numbering.xml><?xml version="1.0" encoding="utf-8"?>
+<file path=word\numbering.xml><?xml version="1.0" encoding="utf-8"?>
 <w:numbering xmlns:wpc="http://schemas.microsoft.com/office/word/2010/wordprocessingCanvas" xmlns:cx="http://schemas.microsoft.com/office/drawing/2014/chartex" xmlns:cx1="http://schemas.microsoft.com/office/drawing/2015/9/8/chartex" xmlns:cx2="http://schemas.microsoft.com/office/drawing/2015/10/21/chartex" xmlns:cx3="http://schemas.microsoft.com/office/drawing/2016/5/9/chartex" xmlns:cx4="http://schemas.microsoft.com/office/drawing/2016/5/10/chartex" xmlns:cx5="http://schemas.microsoft.com/office/drawing/2016/5/11/chartex" xmlns:cx6="http://schemas.microsoft.com/office/drawing/2016/5/12/chartex" xmlns:cx7="http://schemas.microsoft.com/office/drawing/2016/5/13/chartex" xmlns:cx8="http://schemas.microsoft.com/office/drawing/2016/5/14/chartex" xmlns:mc="http://schemas.openxmlformats.org/markup-compatibility/2006" xmlns:aink="http://schemas.microsoft.com/office/drawing/2016/ink" xmlns:am3d="http://schemas.microsoft.com/office/drawing/2017/model3d" xmlns:o="urn:schemas-microsoft-com:office:office" xmlns:oel="http://schemas.microsoft.com/office/2019/extlst" xmlns:r="http://schemas.openxmlformats.org/officeDocument/2006/relationships" xmlns:m="http://schemas.openxmlformats.org/officeDocument/2006/math" xmlns:v="urn:schemas-microsoft-com:vml" xmlns:wp14="http://schemas.microsoft.com/office/word/2010/wordprocessingDrawing" xmlns:wp="http://schemas.openxmlformats.org/drawingml/2006/wordprocessingDrawing" xmlns:w10="urn:schemas-microsoft-com:office:word" xmlns:w="http://schemas.openxmlformats.org/wordprocessingml/2006/main" xmlns:w14="http://schemas.microsoft.com/office/word/2010/wordml" xmlns:w15="http://schemas.microsoft.com/office/word/2012/wordml" xmlns:w16cex="http://schemas.microsoft.com/office/word/2018/wordml/cex" xmlns:w16cid="http://schemas.microsoft.com/office/word/2016/wordml/cid" xmlns:w16="http://schemas.microsoft.com/office/word/2018/wordml" xmlns:w16du="http://schemas.microsoft.com/office/word/2023/wordml/word16du" xmlns:w16sdtdh="http://schemas.microsoft.com/office/word/2020/wordml/sdtdatahash" xmlns:w16sdtfl="http://schemas.microsoft.com/office/word/2024/wordml/sdtformatlock" xmlns:w16se="http://schemas.microsoft.com/office/word/2015/wordml/symex" xmlns:wpg="http://schemas.microsoft.com/office/word/2010/wordprocessingGroup" xmlns:wpi="http://schemas.microsoft.com/office/word/2010/wordprocessingInk" xmlns:wne="http://schemas.microsoft.com/office/word/2006/wordml" xmlns:wps="http://schemas.microsoft.com/office/word/2010/wordprocessingShape" mc:Ignorable="w14 w15 w16se w16cid w16 w16cex w16sdtdh w16sdtfl w16du wp14">
   <w:abstractNum w:abstractNumId="0" w15:restartNumberingAfterBreak="0">
     <w:nsid w:val="037E1642"/>
@@ -13152,7 +13622,501 @@
 </w:numbering>
 </file>
 
-<file path=word/styles.xml><?xml version="1.0" encoding="utf-8"?>
+<file path=word\settings.xml><?xml version="1.0" encoding="utf-8"?>
+<w:settings xmlns:mc="http://schemas.openxmlformats.org/markup-compatibility/2006" xmlns:o="urn:schemas-microsoft-com:office:office" xmlns:r="http://schemas.openxmlformats.org/officeDocument/2006/relationships" xmlns:m="http://schemas.openxmlformats.org/officeDocument/2006/math" xmlns:v="urn:schemas-microsoft-com:vml" xmlns:w10="urn:schemas-microsoft-com:office:word" xmlns:w="http://schemas.openxmlformats.org/wordprocessingml/2006/main" xmlns:w14="http://schemas.microsoft.com/office/word/2010/wordml" xmlns:w15="http://schemas.microsoft.com/office/word/2012/wordml" xmlns:w16cex="http://schemas.microsoft.com/office/word/2018/wordml/cex" xmlns:w16cid="http://schemas.microsoft.com/office/word/2016/wordml/cid" xmlns:w16="http://schemas.microsoft.com/office/word/2018/wordml" xmlns:w16du="http://schemas.microsoft.com/office/word/2023/wordml/word16du" xmlns:w16sdtdh="http://schemas.microsoft.com/office/word/2020/wordml/sdtdatahash" xmlns:w16sdtfl="http://schemas.microsoft.com/office/word/2024/wordml/sdtformatlock" xmlns:w16se="http://schemas.microsoft.com/office/word/2015/wordml/symex" xmlns:sl="http://schemas.openxmlformats.org/schemaLibrary/2006/main" mc:Ignorable="w14 w15 w16se w16cid w16 w16cex w16sdtdh w16sdtfl w16du">
+  <w:zoom w:percent="130"/>
+  <w:proofState w:spelling="clean"/>
+  <w:stylePaneFormatFilter w:val="5124" w:allStyles="0" w:customStyles="0" w:latentStyles="1" w:stylesInUse="0" w:headingStyles="1" w:numberingStyles="0" w:tableStyles="0" w:directFormattingOnRuns="1" w:directFormattingOnParagraphs="0" w:directFormattingOnNumbering="0" w:directFormattingOnTables="0" w:clearFormatting="1" w:top3HeadingStyles="0" w:visibleStyles="1" w:alternateStyleNames="0"/>
+  <w:defaultTabStop w:val="708"/>
+  <w:hyphenationZone w:val="425"/>
+  <w:characterSpacingControl w:val="doNotCompress"/>
+  <w:hdrShapeDefaults>
+    <o:shapedefaults v:ext="edit" spidmax="2050"/>
+  </w:hdrShapeDefaults>
+  <w:footnotePr>
+    <w:footnote w:id="-1"/>
+    <w:footnote w:id="0"/>
+  </w:footnotePr>
+  <w:endnotePr>
+    <w:endnote w:id="-1"/>
+    <w:endnote w:id="0"/>
+  </w:endnotePr>
+  <w:compat>
+    <w:compatSetting w:name="compatibilityMode" w:uri="http://schemas.microsoft.com/office/word" w:val="15"/>
+    <w:compatSetting w:name="overrideTableStyleFontSizeAndJustification" w:uri="http://schemas.microsoft.com/office/word" w:val="1"/>
+    <w:compatSetting w:name="enableOpenTypeFeatures" w:uri="http://schemas.microsoft.com/office/word" w:val="1"/>
+    <w:compatSetting w:name="doNotFlipMirrorIndents" w:uri="http://schemas.microsoft.com/office/word" w:val="1"/>
+    <w:compatSetting w:name="differentiateMultirowTableHeaders" w:uri="http://schemas.microsoft.com/office/word" w:val="1"/>
+    <w:compatSetting w:name="useWord2013TrackBottomHyphenation" w:uri="http://schemas.microsoft.com/office/word" w:val="1"/>
+  </w:compat>
+  <w:rsids>
+    <w:rsidRoot w:val="00E05D9E"/>
+    <w:rsid w:val="00000E9D"/>
+    <w:rsid w:val="00036E88"/>
+    <w:rsid w:val="00057F8B"/>
+    <w:rsid w:val="0009546B"/>
+    <w:rsid w:val="000A6102"/>
+    <w:rsid w:val="000B0D93"/>
+    <w:rsid w:val="000C31D8"/>
+    <w:rsid w:val="000C6E41"/>
+    <w:rsid w:val="000E3DD9"/>
+    <w:rsid w:val="000F29A4"/>
+    <w:rsid w:val="00101BE9"/>
+    <w:rsid w:val="00126486"/>
+    <w:rsid w:val="00127067"/>
+    <w:rsid w:val="00136802"/>
+    <w:rsid w:val="001422D1"/>
+    <w:rsid w:val="00147282"/>
+    <w:rsid w:val="00160CCA"/>
+    <w:rsid w:val="00161A35"/>
+    <w:rsid w:val="00173699"/>
+    <w:rsid w:val="00173E92"/>
+    <w:rsid w:val="001B4CE8"/>
+    <w:rsid w:val="001DC523"/>
+    <w:rsid w:val="001F6534"/>
+    <w:rsid w:val="00204426"/>
+    <w:rsid w:val="00214463"/>
+    <w:rsid w:val="00214DA9"/>
+    <w:rsid w:val="00215B23"/>
+    <w:rsid w:val="00220E71"/>
+    <w:rsid w:val="002221CD"/>
+    <w:rsid w:val="0022496A"/>
+    <w:rsid w:val="00231062"/>
+    <w:rsid w:val="00241DB1"/>
+    <w:rsid w:val="00263DCB"/>
+    <w:rsid w:val="002664C7"/>
+    <w:rsid w:val="002736B7"/>
+    <w:rsid w:val="00283159"/>
+    <w:rsid w:val="00290F70"/>
+    <w:rsid w:val="002ABFAC"/>
+    <w:rsid w:val="002D3196"/>
+    <w:rsid w:val="002D34D6"/>
+    <w:rsid w:val="0030501B"/>
+    <w:rsid w:val="00306B8D"/>
+    <w:rsid w:val="00317E2F"/>
+    <w:rsid w:val="00325547"/>
+    <w:rsid w:val="00326263"/>
+    <w:rsid w:val="00347C3B"/>
+    <w:rsid w:val="003669A2"/>
+    <w:rsid w:val="003704AC"/>
+    <w:rsid w:val="00383628"/>
+    <w:rsid w:val="00386A9E"/>
+    <w:rsid w:val="00396179"/>
+    <w:rsid w:val="00396912"/>
+    <w:rsid w:val="003C23CD"/>
+    <w:rsid w:val="003C2612"/>
+    <w:rsid w:val="003C54E6"/>
+    <w:rsid w:val="003C77E4"/>
+    <w:rsid w:val="003D0152"/>
+    <w:rsid w:val="003E5066"/>
+    <w:rsid w:val="004018DF"/>
+    <w:rsid w:val="00413438"/>
+    <w:rsid w:val="00445A4F"/>
+    <w:rsid w:val="00451CAD"/>
+    <w:rsid w:val="00452762"/>
+    <w:rsid w:val="00463A9D"/>
+    <w:rsid w:val="004A7D4F"/>
+    <w:rsid w:val="004A7EA3"/>
+    <w:rsid w:val="004B0DEA"/>
+    <w:rsid w:val="004C68F9"/>
+    <w:rsid w:val="004D05F5"/>
+    <w:rsid w:val="004E318F"/>
+    <w:rsid w:val="004F1A07"/>
+    <w:rsid w:val="00517FFC"/>
+    <w:rsid w:val="005263FF"/>
+    <w:rsid w:val="005426FF"/>
+    <w:rsid w:val="005557B4"/>
+    <w:rsid w:val="00563770"/>
+    <w:rsid w:val="0058269B"/>
+    <w:rsid w:val="00583892"/>
+    <w:rsid w:val="005A3C9D"/>
+    <w:rsid w:val="005B71AE"/>
+    <w:rsid w:val="005C2A04"/>
+    <w:rsid w:val="005D5D8F"/>
+    <w:rsid w:val="005D7B8B"/>
+    <w:rsid w:val="005F107F"/>
+    <w:rsid w:val="006106EA"/>
+    <w:rsid w:val="00616873"/>
+    <w:rsid w:val="00620812"/>
+    <w:rsid w:val="0062759D"/>
+    <w:rsid w:val="006409EA"/>
+    <w:rsid w:val="00654266"/>
+    <w:rsid w:val="0065508A"/>
+    <w:rsid w:val="0067245D"/>
+    <w:rsid w:val="00674EF7"/>
+    <w:rsid w:val="00694AD5"/>
+    <w:rsid w:val="006A4DF3"/>
+    <w:rsid w:val="006B1635"/>
+    <w:rsid w:val="006D3918"/>
+    <w:rsid w:val="006E1642"/>
+    <w:rsid w:val="006F52D3"/>
+    <w:rsid w:val="006F6199"/>
+    <w:rsid w:val="007149E0"/>
+    <w:rsid w:val="00716388"/>
+    <w:rsid w:val="0073023A"/>
+    <w:rsid w:val="007349F6"/>
+    <w:rsid w:val="00761548"/>
+    <w:rsid w:val="007647AE"/>
+    <w:rsid w:val="0078392A"/>
+    <w:rsid w:val="007856A3"/>
+    <w:rsid w:val="00793B5B"/>
+    <w:rsid w:val="00795717"/>
+    <w:rsid w:val="007C0EEB"/>
+    <w:rsid w:val="007C6D37"/>
+    <w:rsid w:val="007D135D"/>
+    <w:rsid w:val="007D4205"/>
+    <w:rsid w:val="00803190"/>
+    <w:rsid w:val="008237A8"/>
+    <w:rsid w:val="00835397"/>
+    <w:rsid w:val="008536BE"/>
+    <w:rsid w:val="00855386"/>
+    <w:rsid w:val="00877DA1"/>
+    <w:rsid w:val="00886159"/>
+    <w:rsid w:val="00892032"/>
+    <w:rsid w:val="008C2278"/>
+    <w:rsid w:val="008C6B6F"/>
+    <w:rsid w:val="008E17DF"/>
+    <w:rsid w:val="008E33EC"/>
+    <w:rsid w:val="008F0142"/>
+    <w:rsid w:val="008F36E0"/>
+    <w:rsid w:val="008F56FC"/>
+    <w:rsid w:val="00927EB4"/>
+    <w:rsid w:val="0094777E"/>
+    <w:rsid w:val="00953CEF"/>
+    <w:rsid w:val="00954CC0"/>
+    <w:rsid w:val="009611E8"/>
+    <w:rsid w:val="00970DA9"/>
+    <w:rsid w:val="00971CEE"/>
+    <w:rsid w:val="00971ECA"/>
+    <w:rsid w:val="00973280"/>
+    <w:rsid w:val="009A45B5"/>
+    <w:rsid w:val="009A4D13"/>
+    <w:rsid w:val="009A7652"/>
+    <w:rsid w:val="009B1257"/>
+    <w:rsid w:val="009B703C"/>
+    <w:rsid w:val="009C76C4"/>
+    <w:rsid w:val="009D3526"/>
+    <w:rsid w:val="009F5908"/>
+    <w:rsid w:val="009F76BD"/>
+    <w:rsid w:val="00A117E1"/>
+    <w:rsid w:val="00A22BA3"/>
+    <w:rsid w:val="00A30355"/>
+    <w:rsid w:val="00A34AFF"/>
+    <w:rsid w:val="00A50897"/>
+    <w:rsid w:val="00A558E4"/>
+    <w:rsid w:val="00A97FAF"/>
+    <w:rsid w:val="00AC304C"/>
+    <w:rsid w:val="00AC7E78"/>
+    <w:rsid w:val="00AE5714"/>
+    <w:rsid w:val="00AE6CDB"/>
+    <w:rsid w:val="00AF1B2A"/>
+    <w:rsid w:val="00B26994"/>
+    <w:rsid w:val="00B352B3"/>
+    <w:rsid w:val="00B4235A"/>
+    <w:rsid w:val="00B50F94"/>
+    <w:rsid w:val="00B61C86"/>
+    <w:rsid w:val="00B70F8F"/>
+    <w:rsid w:val="00B83580"/>
+    <w:rsid w:val="00B94BB9"/>
+    <w:rsid w:val="00B96E04"/>
+    <w:rsid w:val="00BA42EC"/>
+    <w:rsid w:val="00BA661B"/>
+    <w:rsid w:val="00BB56F9"/>
+    <w:rsid w:val="00BC7CCA"/>
+    <w:rsid w:val="00BE75A8"/>
+    <w:rsid w:val="00BF1408"/>
+    <w:rsid w:val="00C06AEE"/>
+    <w:rsid w:val="00C10CD1"/>
+    <w:rsid w:val="00C148E8"/>
+    <w:rsid w:val="00C4282A"/>
+    <w:rsid w:val="00C44FAD"/>
+    <w:rsid w:val="00C66182"/>
+    <w:rsid w:val="00C677FA"/>
+    <w:rsid w:val="00C76476"/>
+    <w:rsid w:val="00C83447"/>
+    <w:rsid w:val="00CA14B8"/>
+    <w:rsid w:val="00CA4DBB"/>
+    <w:rsid w:val="00CA5A66"/>
+    <w:rsid w:val="00CC16E4"/>
+    <w:rsid w:val="00CD0140"/>
+    <w:rsid w:val="00CD7279"/>
+    <w:rsid w:val="00CE53DB"/>
+    <w:rsid w:val="00CF4C88"/>
+    <w:rsid w:val="00CF6757"/>
+    <w:rsid w:val="00D16427"/>
+    <w:rsid w:val="00D30517"/>
+    <w:rsid w:val="00D3274A"/>
+    <w:rsid w:val="00D3346D"/>
+    <w:rsid w:val="00D54FDE"/>
+    <w:rsid w:val="00D66300"/>
+    <w:rsid w:val="00DC4841"/>
+    <w:rsid w:val="00E04238"/>
+    <w:rsid w:val="00E05D9E"/>
+    <w:rsid w:val="00E63541"/>
+    <w:rsid w:val="00E86514"/>
+    <w:rsid w:val="00E92505"/>
+    <w:rsid w:val="00EA22DE"/>
+    <w:rsid w:val="00EA7403"/>
+    <w:rsid w:val="00ED605C"/>
+    <w:rsid w:val="00ED7196"/>
+    <w:rsid w:val="00EF6911"/>
+    <w:rsid w:val="00F25EF5"/>
+    <w:rsid w:val="00F522B2"/>
+    <w:rsid w:val="00F616BC"/>
+    <w:rsid w:val="00F705BA"/>
+    <w:rsid w:val="00FA1CF5"/>
+    <w:rsid w:val="00FC2811"/>
+    <w:rsid w:val="00FE60BA"/>
+    <w:rsid w:val="00FE7E69"/>
+    <w:rsid w:val="0133A2CA"/>
+    <w:rsid w:val="01D548FD"/>
+    <w:rsid w:val="02EF7F97"/>
+    <w:rsid w:val="04B045AB"/>
+    <w:rsid w:val="0508F723"/>
+    <w:rsid w:val="053FBB13"/>
+    <w:rsid w:val="05D055D9"/>
+    <w:rsid w:val="05E4B074"/>
+    <w:rsid w:val="066D94EE"/>
+    <w:rsid w:val="0687E688"/>
+    <w:rsid w:val="06AF0925"/>
+    <w:rsid w:val="0909105B"/>
+    <w:rsid w:val="09D511BA"/>
+    <w:rsid w:val="09E79007"/>
+    <w:rsid w:val="09F7780B"/>
+    <w:rsid w:val="09FB6D50"/>
+    <w:rsid w:val="0A0CC5EB"/>
+    <w:rsid w:val="0A56CA85"/>
+    <w:rsid w:val="0A5DFE8B"/>
+    <w:rsid w:val="0B5FF20C"/>
+    <w:rsid w:val="0D2E4F4F"/>
+    <w:rsid w:val="0D6CDCA2"/>
+    <w:rsid w:val="0D8AABEC"/>
+    <w:rsid w:val="0E155689"/>
+    <w:rsid w:val="0E20B02F"/>
+    <w:rsid w:val="0E79FA39"/>
+    <w:rsid w:val="0E97FEBD"/>
+    <w:rsid w:val="112B484E"/>
+    <w:rsid w:val="11C03E61"/>
+    <w:rsid w:val="128FA49A"/>
+    <w:rsid w:val="12B3184F"/>
+    <w:rsid w:val="12C770AE"/>
+    <w:rsid w:val="12ED5AFF"/>
+    <w:rsid w:val="1400D846"/>
+    <w:rsid w:val="1475FC13"/>
+    <w:rsid w:val="15A5CEF5"/>
+    <w:rsid w:val="16C8222C"/>
+    <w:rsid w:val="176E4286"/>
+    <w:rsid w:val="17A4B450"/>
+    <w:rsid w:val="1808E149"/>
+    <w:rsid w:val="186F2A2A"/>
+    <w:rsid w:val="1A0CC4FF"/>
+    <w:rsid w:val="1A31D9B6"/>
+    <w:rsid w:val="1AFF906C"/>
+    <w:rsid w:val="1B44884F"/>
+    <w:rsid w:val="1CD49EC2"/>
+    <w:rsid w:val="1CF91DA7"/>
+    <w:rsid w:val="1D5C0680"/>
+    <w:rsid w:val="1E35B91C"/>
+    <w:rsid w:val="1E4D167A"/>
+    <w:rsid w:val="1E65E53F"/>
+    <w:rsid w:val="1F9179C9"/>
+    <w:rsid w:val="1FB77614"/>
+    <w:rsid w:val="201CEB3F"/>
+    <w:rsid w:val="205E0E87"/>
+    <w:rsid w:val="2087CB88"/>
+    <w:rsid w:val="21445036"/>
+    <w:rsid w:val="2230CB40"/>
+    <w:rsid w:val="226EF50E"/>
+    <w:rsid w:val="2362BB9E"/>
+    <w:rsid w:val="23E13DB1"/>
+    <w:rsid w:val="242C0328"/>
+    <w:rsid w:val="2544A5B3"/>
+    <w:rsid w:val="25846529"/>
+    <w:rsid w:val="26490BB3"/>
+    <w:rsid w:val="271ACBAE"/>
+    <w:rsid w:val="275CE5D9"/>
+    <w:rsid w:val="27F398F2"/>
+    <w:rsid w:val="28738D58"/>
+    <w:rsid w:val="299C9489"/>
+    <w:rsid w:val="2A22922A"/>
+    <w:rsid w:val="2AA5070E"/>
+    <w:rsid w:val="2C8E5230"/>
+    <w:rsid w:val="2CA14C5C"/>
+    <w:rsid w:val="2CB9E852"/>
+    <w:rsid w:val="2CFCB099"/>
+    <w:rsid w:val="2D49C7E0"/>
+    <w:rsid w:val="2F24C988"/>
+    <w:rsid w:val="2F80F981"/>
+    <w:rsid w:val="3000F5BF"/>
+    <w:rsid w:val="3043BCD2"/>
+    <w:rsid w:val="3068FDC2"/>
+    <w:rsid w:val="30B44638"/>
+    <w:rsid w:val="313F580D"/>
+    <w:rsid w:val="314E066E"/>
+    <w:rsid w:val="32EA5B65"/>
+    <w:rsid w:val="33487E5D"/>
+    <w:rsid w:val="34082737"/>
+    <w:rsid w:val="340D3C6F"/>
+    <w:rsid w:val="347A728A"/>
+    <w:rsid w:val="34E07F8E"/>
+    <w:rsid w:val="359ED29F"/>
+    <w:rsid w:val="36239EAD"/>
+    <w:rsid w:val="373ECCFC"/>
+    <w:rsid w:val="37F518EF"/>
+    <w:rsid w:val="38707205"/>
+    <w:rsid w:val="3945AC78"/>
+    <w:rsid w:val="3A1395AA"/>
+    <w:rsid w:val="3A519D90"/>
+    <w:rsid w:val="3AAA308A"/>
+    <w:rsid w:val="3BC89070"/>
+    <w:rsid w:val="3C18B77D"/>
+    <w:rsid w:val="3CAFEF6B"/>
+    <w:rsid w:val="3DAC5428"/>
+    <w:rsid w:val="3DEAE1C1"/>
+    <w:rsid w:val="3F118E05"/>
+    <w:rsid w:val="3F9FDA4A"/>
+    <w:rsid w:val="413A878E"/>
+    <w:rsid w:val="4233D568"/>
+    <w:rsid w:val="42BD19D7"/>
+    <w:rsid w:val="42EA44CA"/>
+    <w:rsid w:val="42F85AC6"/>
+    <w:rsid w:val="4429B8B4"/>
+    <w:rsid w:val="44555B8B"/>
+    <w:rsid w:val="446848EE"/>
+    <w:rsid w:val="44AE1FC0"/>
+    <w:rsid w:val="44BA32D0"/>
+    <w:rsid w:val="44E4BA53"/>
+    <w:rsid w:val="463CE85A"/>
+    <w:rsid w:val="46A5498F"/>
+    <w:rsid w:val="472382FD"/>
+    <w:rsid w:val="47370EAB"/>
+    <w:rsid w:val="474F7F9E"/>
+    <w:rsid w:val="48AE0207"/>
+    <w:rsid w:val="48C1BAD4"/>
+    <w:rsid w:val="4946FBC6"/>
+    <w:rsid w:val="4A0E5D2E"/>
+    <w:rsid w:val="4B26C736"/>
+    <w:rsid w:val="4BBAC270"/>
+    <w:rsid w:val="4C986293"/>
+    <w:rsid w:val="4D8A72D1"/>
+    <w:rsid w:val="4DEF44F0"/>
+    <w:rsid w:val="4F14A071"/>
+    <w:rsid w:val="4F2528A5"/>
+    <w:rsid w:val="4FABC0DD"/>
+    <w:rsid w:val="4FCAFD5C"/>
+    <w:rsid w:val="503912CD"/>
+    <w:rsid w:val="507698F6"/>
+    <w:rsid w:val="509B6487"/>
+    <w:rsid w:val="50A62AAA"/>
+    <w:rsid w:val="523E6DCF"/>
+    <w:rsid w:val="5290217E"/>
+    <w:rsid w:val="531EB9D8"/>
+    <w:rsid w:val="53ED2987"/>
+    <w:rsid w:val="54102348"/>
+    <w:rsid w:val="54BC3981"/>
+    <w:rsid w:val="54DDB7C5"/>
+    <w:rsid w:val="5551D175"/>
+    <w:rsid w:val="55534333"/>
+    <w:rsid w:val="55CEEB57"/>
+    <w:rsid w:val="57B99B9B"/>
+    <w:rsid w:val="57FA7093"/>
+    <w:rsid w:val="58410B1E"/>
+    <w:rsid w:val="585BDBB6"/>
+    <w:rsid w:val="586FE0AB"/>
+    <w:rsid w:val="58E016E2"/>
+    <w:rsid w:val="593796C3"/>
+    <w:rsid w:val="5A3A9A54"/>
+    <w:rsid w:val="5A8241AB"/>
+    <w:rsid w:val="5A8D5CB5"/>
+    <w:rsid w:val="5B0243B5"/>
+    <w:rsid w:val="5CF7CB85"/>
+    <w:rsid w:val="5D0F7A54"/>
+    <w:rsid w:val="5E2C28D8"/>
+    <w:rsid w:val="5E898C18"/>
+    <w:rsid w:val="5EF5DD1D"/>
+    <w:rsid w:val="5F3B2B1E"/>
+    <w:rsid w:val="6008618D"/>
+    <w:rsid w:val="60A2F455"/>
+    <w:rsid w:val="615810F4"/>
+    <w:rsid w:val="62C8B876"/>
+    <w:rsid w:val="64B89020"/>
+    <w:rsid w:val="65F4D633"/>
+    <w:rsid w:val="65F51281"/>
+    <w:rsid w:val="67736AED"/>
+    <w:rsid w:val="67A33C69"/>
+    <w:rsid w:val="6925744A"/>
+    <w:rsid w:val="694BBCC3"/>
+    <w:rsid w:val="6954C0B3"/>
+    <w:rsid w:val="69D1CBCB"/>
+    <w:rsid w:val="69DAF81C"/>
+    <w:rsid w:val="6A765E72"/>
+    <w:rsid w:val="6ADFE46E"/>
+    <w:rsid w:val="6B0B1F69"/>
+    <w:rsid w:val="6B47664B"/>
+    <w:rsid w:val="6CCDE87B"/>
+    <w:rsid w:val="6CF968C7"/>
+    <w:rsid w:val="6DDA2C15"/>
+    <w:rsid w:val="6E99A2F1"/>
+    <w:rsid w:val="6FCF1DEB"/>
+    <w:rsid w:val="6FEBDEB8"/>
+    <w:rsid w:val="6FF7C0F9"/>
+    <w:rsid w:val="70BF0BED"/>
+    <w:rsid w:val="713CC83B"/>
+    <w:rsid w:val="7147674F"/>
+    <w:rsid w:val="72919E04"/>
+    <w:rsid w:val="72C49052"/>
+    <w:rsid w:val="73074738"/>
+    <w:rsid w:val="73A1C959"/>
+    <w:rsid w:val="74BF7C95"/>
+    <w:rsid w:val="7626C403"/>
+    <w:rsid w:val="76AB940B"/>
+    <w:rsid w:val="76B7A7BA"/>
+    <w:rsid w:val="77B97829"/>
+    <w:rsid w:val="7945156D"/>
+    <w:rsid w:val="79988405"/>
+    <w:rsid w:val="7A10564E"/>
+    <w:rsid w:val="7A2B49ED"/>
+    <w:rsid w:val="7A75AD56"/>
+    <w:rsid w:val="7B67F96C"/>
+    <w:rsid w:val="7B9A3A01"/>
+    <w:rsid w:val="7BD50D4F"/>
+    <w:rsid w:val="7C78AC34"/>
+    <w:rsid w:val="7CEE7BAE"/>
+    <w:rsid w:val="7D12FEA7"/>
+    <w:rsid w:val="7D137843"/>
+    <w:rsid w:val="7F307EA2"/>
+    <w:rsid w:val="7FB60957"/>
+  </w:rsids>
+  <m:mathPr>
+    <m:mathFont m:val="Cambria Math"/>
+    <m:brkBin m:val="before"/>
+    <m:brkBinSub m:val="--"/>
+    <m:smallFrac m:val="0"/>
+    <m:dispDef/>
+    <m:lMargin m:val="0"/>
+    <m:rMargin m:val="0"/>
+    <m:defJc m:val="centerGroup"/>
+    <m:wrapIndent m:val="1440"/>
+    <m:intLim m:val="subSup"/>
+    <m:naryLim m:val="undOvr"/>
+  </m:mathPr>
+  <w:themeFontLang w:val="es-CL"/>
+  <w:clrSchemeMapping w:bg1="light1" w:t1="dark1" w:bg2="light2" w:t2="dark2" w:accent1="accent1" w:accent2="accent2" w:accent3="accent3" w:accent4="accent4" w:accent5="accent5" w:accent6="accent6" w:hyperlink="hyperlink" w:followedHyperlink="followedHyperlink"/>
+  <w:shapeDefaults>
+    <o:shapedefaults v:ext="edit" spidmax="2050"/>
+    <o:shapelayout v:ext="edit">
+      <o:idmap v:ext="edit" data="2"/>
+    </o:shapelayout>
+  </w:shapeDefaults>
+  <w:decimalSymbol w:val=","/>
+  <w:listSeparator w:val=";"/>
+  <w14:docId w14:val="77D1C409"/>
+  <w15:chartTrackingRefBased/>
+  <w15:docId w15:val="{2257A518-944F-4F95-9933-F0DB08FA248B}"/>
+</w:settings>
+</file>
+
+<file path=word\styles.xml><?xml version="1.0" encoding="utf-8"?>
 <w:styles xmlns:mc="http://schemas.openxmlformats.org/markup-compatibility/2006" xmlns:r="http://schemas.openxmlformats.org/officeDocument/2006/relationships" xmlns:w="http://schemas.openxmlformats.org/wordprocessingml/2006/main" xmlns:w14="http://schemas.microsoft.com/office/word/2010/wordml" xmlns:w15="http://schemas.microsoft.com/office/word/2012/wordml" xmlns:w16cex="http://schemas.microsoft.com/office/word/2018/wordml/cex" xmlns:w16cid="http://schemas.microsoft.com/office/word/2016/wordml/cid" xmlns:w16="http://schemas.microsoft.com/office/word/2018/wordml" xmlns:w16du="http://schemas.microsoft.com/office/word/2023/wordml/word16du" xmlns:w16sdtdh="http://schemas.microsoft.com/office/word/2020/wordml/sdtdatahash" xmlns:w16sdtfl="http://schemas.microsoft.com/office/word/2024/wordml/sdtformatlock" xmlns:w16se="http://schemas.microsoft.com/office/word/2015/wordml/symex" mc:Ignorable="w14 w15 w16se w16cid w16 w16cex w16sdtdh w16sdtfl w16du">
   <w:docDefaults>
     <w:rPrDefault>
@@ -14275,7 +15239,7 @@
 </w:styles>
 </file>
 
-<file path=word/theme/theme1.xml><?xml version="1.0" encoding="utf-8"?>
+<file path=word\theme\theme1.xml><?xml version="1.0" encoding="utf-8"?>
 <a:theme xmlns:a="http://schemas.openxmlformats.org/drawingml/2006/main" name="Tema de Office">
   <a:themeElements>
     <a:clrScheme name="Office">
@@ -14536,343 +15500,10 @@
 </a:theme>
 </file>
 
-<file path=customXml/item1.xml><?xml version="1.0" encoding="utf-8"?>
-<?mso-contentType ?>
-<FormTemplates xmlns="http://schemas.microsoft.com/sharepoint/v3/contenttype/forms">
-  <Display>DocumentLibraryForm</Display>
-  <Edit>DocumentLibraryForm</Edit>
-  <New>DocumentLibraryForm</New>
-</FormTemplates>
-</file>
-
-<file path=customXml/item2.xml><?xml version="1.0" encoding="utf-8"?>
-<b:Sources xmlns:b="http://schemas.openxmlformats.org/officeDocument/2006/bibliography" xmlns="http://schemas.openxmlformats.org/officeDocument/2006/bibliography" SelectedStyle="\APASixthEditionOfficeOnline.xsl" StyleName="APA" Version="6"/>
-</file>
-
-<file path=customXml/item3.xml><?xml version="1.0" encoding="utf-8"?>
-<p:properties xmlns:p="http://schemas.microsoft.com/office/2006/metadata/properties" xmlns:xsi="http://www.w3.org/2001/XMLSchema-instance" xmlns:pc="http://schemas.microsoft.com/office/infopath/2007/PartnerControls">
-  <documentManagement>
-    <lcf76f155ced4ddcb4097134ff3c332f xmlns="d0daa353-f819-43d1-badf-ce69fea8800d">
-      <Terms xmlns="http://schemas.microsoft.com/office/infopath/2007/PartnerControls"/>
-    </lcf76f155ced4ddcb4097134ff3c332f>
-    <TaxCatchAll xmlns="edc1eb1c-f9b5-429a-a0ce-702847a0aa2d" xsi:nil="true"/>
-    <Fecha_x0020_de_x0020_creaci_x00f3_n xmlns="d0daa353-f819-43d1-badf-ce69fea8800d" xsi:nil="true"/>
-    <Fechayhora xmlns="d0daa353-f819-43d1-badf-ce69fea8800d" xsi:nil="true"/>
-    <SharedWithUsers xmlns="edc1eb1c-f9b5-429a-a0ce-702847a0aa2d">
-      <UserInfo>
-        <DisplayName/>
-        <AccountId xsi:nil="true"/>
-        <AccountType/>
-      </UserInfo>
-    </SharedWithUsers>
-    <MediaLengthInSeconds xmlns="d0daa353-f819-43d1-badf-ce69fea8800d" xsi:nil="true"/>
-  </documentManagement>
-</p:properties>
-</file>
-
-<file path=customXml/item4.xml><?xml version="1.0" encoding="utf-8"?>
-<ct:contentTypeSchema xmlns:ct="http://schemas.microsoft.com/office/2006/metadata/contentType" xmlns:ma="http://schemas.microsoft.com/office/2006/metadata/properties/metaAttributes" ct:_="" ma:_="" ma:contentTypeName="Documento" ma:contentTypeID="0x01010070BFDEA41A5D8B46AA5DA2E2389CBE4E" ma:contentTypeVersion="19" ma:contentTypeDescription="Crear nuevo documento." ma:contentTypeScope="" ma:versionID="8582924e0409c10a8a1fc1eca5dfbb2e">
-  <xsd:schema xmlns:xsd="http://www.w3.org/2001/XMLSchema" xmlns:xs="http://www.w3.org/2001/XMLSchema" xmlns:p="http://schemas.microsoft.com/office/2006/metadata/properties" xmlns:ns2="d0daa353-f819-43d1-badf-ce69fea8800d" xmlns:ns3="edc1eb1c-f9b5-429a-a0ce-702847a0aa2d" targetNamespace="http://schemas.microsoft.com/office/2006/metadata/properties" ma:root="true" ma:fieldsID="e4d7d6d0f63e48ebe5e4a9f31787ab41" ns2:_="" ns3:_="">
-    <xsd:import namespace="d0daa353-f819-43d1-badf-ce69fea8800d"/>
-    <xsd:import namespace="edc1eb1c-f9b5-429a-a0ce-702847a0aa2d"/>
-    <xsd:element name="properties">
-      <xsd:complexType>
-        <xsd:sequence>
-          <xsd:element name="documentManagement">
-            <xsd:complexType>
-              <xsd:all>
-                <xsd:element ref="ns2:MediaServiceMetadata" minOccurs="0"/>
-                <xsd:element ref="ns2:MediaServiceFastMetadata" minOccurs="0"/>
-                <xsd:element ref="ns2:MediaServiceDateTaken" minOccurs="0"/>
-                <xsd:element ref="ns2:MediaLengthInSeconds" minOccurs="0"/>
-                <xsd:element ref="ns2:MediaServiceAutoTags" minOccurs="0"/>
-                <xsd:element ref="ns2:MediaServiceOCR" minOccurs="0"/>
-                <xsd:element ref="ns2:MediaServiceGenerationTime" minOccurs="0"/>
-                <xsd:element ref="ns2:MediaServiceEventHashCode" minOccurs="0"/>
-                <xsd:element ref="ns3:SharedWithUsers" minOccurs="0"/>
-                <xsd:element ref="ns3:SharedWithDetails" minOccurs="0"/>
-                <xsd:element ref="ns2:MediaServiceAutoKeyPoints" minOccurs="0"/>
-                <xsd:element ref="ns2:MediaServiceKeyPoints" minOccurs="0"/>
-                <xsd:element ref="ns2:Fechayhora" minOccurs="0"/>
-                <xsd:element ref="ns2:Fecha_x0020_de_x0020_creaci_x00f3_n" minOccurs="0"/>
-                <xsd:element ref="ns2:lcf76f155ced4ddcb4097134ff3c332f" minOccurs="0"/>
-                <xsd:element ref="ns3:TaxCatchAll" minOccurs="0"/>
-                <xsd:element ref="ns2:MediaServiceObjectDetectorVersions" minOccurs="0"/>
-                <xsd:element ref="ns2:MediaServiceSearchProperties" minOccurs="0"/>
-              </xsd:all>
-            </xsd:complexType>
-          </xsd:element>
-        </xsd:sequence>
-      </xsd:complexType>
-    </xsd:element>
-  </xsd:schema>
-  <xsd:schema xmlns:xsd="http://www.w3.org/2001/XMLSchema" xmlns:xs="http://www.w3.org/2001/XMLSchema" xmlns:dms="http://schemas.microsoft.com/office/2006/documentManagement/types" xmlns:pc="http://schemas.microsoft.com/office/infopath/2007/PartnerControls" targetNamespace="d0daa353-f819-43d1-badf-ce69fea8800d" elementFormDefault="qualified">
-    <xsd:import namespace="http://schemas.microsoft.com/office/2006/documentManagement/types"/>
-    <xsd:import namespace="http://schemas.microsoft.com/office/infopath/2007/PartnerControls"/>
-    <xsd:element name="MediaServiceMetadata" ma:index="8" nillable="true" ma:displayName="MediaServiceMetadata" ma:hidden="true" ma:internalName="MediaServiceMetadata" ma:readOnly="true">
-      <xsd:simpleType>
-        <xsd:restriction base="dms:Note"/>
-      </xsd:simpleType>
-    </xsd:element>
-    <xsd:element name="MediaServiceFastMetadata" ma:index="9" nillable="true" ma:displayName="MediaServiceFastMetadata" ma:hidden="true" ma:internalName="MediaServiceFastMetadata" ma:readOnly="true">
-      <xsd:simpleType>
-        <xsd:restriction base="dms:Note"/>
-      </xsd:simpleType>
-    </xsd:element>
-    <xsd:element name="MediaServiceDateTaken" ma:index="10" nillable="true" ma:displayName="MediaServiceDateTaken" ma:hidden="true" ma:internalName="MediaServiceDateTaken" ma:readOnly="true">
-      <xsd:simpleType>
-        <xsd:restriction base="dms:Text"/>
-      </xsd:simpleType>
-    </xsd:element>
-    <xsd:element name="MediaLengthInSeconds" ma:index="11" nillable="true" ma:displayName="Length (seconds)" ma:internalName="MediaLengthInSeconds" ma:readOnly="true">
-      <xsd:simpleType>
-        <xsd:restriction base="dms:Unknown"/>
-      </xsd:simpleType>
-    </xsd:element>
-    <xsd:element name="MediaServiceAutoTags" ma:index="12" nillable="true" ma:displayName="Tags" ma:internalName="MediaServiceAutoTags" ma:readOnly="true">
-      <xsd:simpleType>
-        <xsd:restriction base="dms:Text"/>
-      </xsd:simpleType>
-    </xsd:element>
-    <xsd:element name="MediaServiceOCR" ma:index="13" nillable="true" ma:displayName="Extracted Text" ma:internalName="MediaServiceOCR" ma:readOnly="true">
-      <xsd:simpleType>
-        <xsd:restriction base="dms:Note">
-          <xsd:maxLength value="255"/>
-        </xsd:restriction>
-      </xsd:simpleType>
-    </xsd:element>
-    <xsd:element name="MediaServiceGenerationTime" ma:index="14" nillable="true" ma:displayName="MediaServiceGenerationTime" ma:hidden="true" ma:internalName="MediaServiceGenerationTime" ma:readOnly="true">
-      <xsd:simpleType>
-        <xsd:restriction base="dms:Text"/>
-      </xsd:simpleType>
-    </xsd:element>
-    <xsd:element name="MediaServiceEventHashCode" ma:index="15" nillable="true" ma:displayName="MediaServiceEventHashCode" ma:hidden="true" ma:internalName="MediaServiceEventHashCode" ma:readOnly="true">
-      <xsd:simpleType>
-        <xsd:restriction base="dms:Text"/>
-      </xsd:simpleType>
-    </xsd:element>
-    <xsd:element name="MediaServiceAutoKeyPoints" ma:index="18" nillable="true" ma:displayName="MediaServiceAutoKeyPoints" ma:hidden="true" ma:internalName="MediaServiceAutoKeyPoints" ma:readOnly="true">
-      <xsd:simpleType>
-        <xsd:restriction base="dms:Note"/>
-      </xsd:simpleType>
-    </xsd:element>
-    <xsd:element name="MediaServiceKeyPoints" ma:index="19" nillable="true" ma:displayName="KeyPoints" ma:internalName="MediaServiceKeyPoints" ma:readOnly="true">
-      <xsd:simpleType>
-        <xsd:restriction base="dms:Note">
-          <xsd:maxLength value="255"/>
-        </xsd:restriction>
-      </xsd:simpleType>
-    </xsd:element>
-    <xsd:element name="Fechayhora" ma:index="20" nillable="true" ma:displayName="Fecha y hora" ma:format="DateTime" ma:internalName="Fechayhora">
-      <xsd:simpleType>
-        <xsd:restriction base="dms:DateTime"/>
-      </xsd:simpleType>
-    </xsd:element>
-    <xsd:element name="Fecha_x0020_de_x0020_creaci_x00f3_n" ma:index="21" nillable="true" ma:displayName="Fecha de creación" ma:format="DateTime" ma:internalName="Fecha_x0020_de_x0020_creaci_x00f3_n">
-      <xsd:simpleType>
-        <xsd:restriction base="dms:DateTime"/>
-      </xsd:simpleType>
-    </xsd:element>
-    <xsd:element name="lcf76f155ced4ddcb4097134ff3c332f" ma:index="23" nillable="true" ma:taxonomy="true" ma:internalName="lcf76f155ced4ddcb4097134ff3c332f" ma:taxonomyFieldName="MediaServiceImageTags" ma:displayName="Etiquetas de imagen" ma:readOnly="false" ma:fieldId="{5cf76f15-5ced-4ddc-b409-7134ff3c332f}" ma:taxonomyMulti="true" ma:sspId="e2f773bf-f00b-42a6-8b07-050935be226b" ma:termSetId="09814cd3-568e-fe90-9814-8d621ff8fb84" ma:anchorId="fba54fb3-c3e1-fe81-a776-ca4b69148c4d" ma:open="true" ma:isKeyword="false">
-      <xsd:complexType>
-        <xsd:sequence>
-          <xsd:element ref="pc:Terms" minOccurs="0" maxOccurs="1"/>
-        </xsd:sequence>
-      </xsd:complexType>
-    </xsd:element>
-    <xsd:element name="MediaServiceObjectDetectorVersions" ma:index="25" nillable="true" ma:displayName="MediaServiceObjectDetectorVersions" ma:description="" ma:hidden="true" ma:indexed="true" ma:internalName="MediaServiceObjectDetectorVersions" ma:readOnly="true">
-      <xsd:simpleType>
-        <xsd:restriction base="dms:Text"/>
-      </xsd:simpleType>
-    </xsd:element>
-    <xsd:element name="MediaServiceSearchProperties" ma:index="26" nillable="true" ma:displayName="MediaServiceSearchProperties" ma:hidden="true" ma:internalName="MediaServiceSearchProperties" ma:readOnly="true">
-      <xsd:simpleType>
-        <xsd:restriction base="dms:Note"/>
-      </xsd:simpleType>
-    </xsd:element>
-  </xsd:schema>
-  <xsd:schema xmlns:xsd="http://www.w3.org/2001/XMLSchema" xmlns:xs="http://www.w3.org/2001/XMLSchema" xmlns:dms="http://schemas.microsoft.com/office/2006/documentManagement/types" xmlns:pc="http://schemas.microsoft.com/office/infopath/2007/PartnerControls" targetNamespace="edc1eb1c-f9b5-429a-a0ce-702847a0aa2d" elementFormDefault="qualified">
-    <xsd:import namespace="http://schemas.microsoft.com/office/2006/documentManagement/types"/>
-    <xsd:import namespace="http://schemas.microsoft.com/office/infopath/2007/PartnerControls"/>
-    <xsd:element name="SharedWithUsers" ma:index="16" nillable="true" ma:displayName="Compartido con" ma:internalName="SharedWithUsers" ma:readOnly="true">
-      <xsd:complexType>
-        <xsd:complexContent>
-          <xsd:extension base="dms:UserMulti">
-            <xsd:sequence>
-              <xsd:element name="UserInfo" minOccurs="0" maxOccurs="unbounded">
-                <xsd:complexType>
-                  <xsd:sequence>
-                    <xsd:element name="DisplayName" type="xsd:string" minOccurs="0"/>
-                    <xsd:element name="AccountId" type="dms:UserId" minOccurs="0" nillable="true"/>
-                    <xsd:element name="AccountType" type="xsd:string" minOccurs="0"/>
-                  </xsd:sequence>
-                </xsd:complexType>
-              </xsd:element>
-            </xsd:sequence>
-          </xsd:extension>
-        </xsd:complexContent>
-      </xsd:complexType>
-    </xsd:element>
-    <xsd:element name="SharedWithDetails" ma:index="17" nillable="true" ma:displayName="Detalles de uso compartido" ma:internalName="SharedWithDetails" ma:readOnly="true">
-      <xsd:simpleType>
-        <xsd:restriction base="dms:Note">
-          <xsd:maxLength value="255"/>
-        </xsd:restriction>
-      </xsd:simpleType>
-    </xsd:element>
-    <xsd:element name="TaxCatchAll" ma:index="24" nillable="true" ma:displayName="Taxonomy Catch All Column" ma:hidden="true" ma:list="{9beb23f2-04a0-4483-9f40-448d491ccbe9}" ma:internalName="TaxCatchAll" ma:showField="CatchAllData" ma:web="edc1eb1c-f9b5-429a-a0ce-702847a0aa2d">
-      <xsd:complexType>
-        <xsd:complexContent>
-          <xsd:extension base="dms:MultiChoiceLookup">
-            <xsd:sequence>
-              <xsd:element name="Value" type="dms:Lookup" maxOccurs="unbounded" minOccurs="0" nillable="true"/>
-            </xsd:sequence>
-          </xsd:extension>
-        </xsd:complexContent>
-      </xsd:complexType>
-    </xsd:element>
-  </xsd:schema>
-  <xsd:schema xmlns="http://schemas.openxmlformats.org/package/2006/metadata/core-properties" xmlns:xsd="http://www.w3.org/2001/XMLSchema" xmlns:xsi="http://www.w3.org/2001/XMLSchema-instance" xmlns:dc="http://purl.org/dc/elements/1.1/" xmlns:dcterms="http://purl.org/dc/terms/" xmlns:odoc="http://schemas.microsoft.com/internal/obd" targetNamespace="http://schemas.openxmlformats.org/package/2006/metadata/core-properties" elementFormDefault="qualified" attributeFormDefault="unqualified" blockDefault="#all">
-    <xsd:import namespace="http://purl.org/dc/elements/1.1/" schemaLocation="http://dublincore.org/schemas/xmls/qdc/2003/04/02/dc.xsd"/>
-    <xsd:import namespace="http://purl.org/dc/terms/" schemaLocation="http://dublincore.org/schemas/xmls/qdc/2003/04/02/dcterms.xsd"/>
-    <xsd:element name="coreProperties" type="CT_coreProperties"/>
-    <xsd:complexType name="CT_coreProperties">
-      <xsd:all>
-        <xsd:element ref="dc:creator" minOccurs="0" maxOccurs="1"/>
-        <xsd:element ref="dcterms:created" minOccurs="0" maxOccurs="1"/>
-        <xsd:element ref="dc:identifier" minOccurs="0" maxOccurs="1"/>
-        <xsd:element name="contentType" minOccurs="0" maxOccurs="1" type="xsd:string" ma:index="0" ma:displayName="Tipo de contenido"/>
-        <xsd:element ref="dc:title" minOccurs="0" maxOccurs="1" ma:index="4" ma:displayName="Título"/>
-        <xsd:element ref="dc:subject" minOccurs="0" maxOccurs="1"/>
-        <xsd:element ref="dc:description" minOccurs="0" maxOccurs="1"/>
-        <xsd:element name="keywords" minOccurs="0" maxOccurs="1" type="xsd:string"/>
-        <xsd:element ref="dc:language" minOccurs="0" maxOccurs="1"/>
-        <xsd:element name="category" minOccurs="0" maxOccurs="1" type="xsd:string"/>
-        <xsd:element name="version" minOccurs="0" maxOccurs="1" type="xsd:string"/>
-        <xsd:element name="revision" minOccurs="0" maxOccurs="1" type="xsd:string">
-          <xsd:annotation>
-            <xsd:documentation>
-                        This value indicates the number of saves or revisions. The application is responsible for updating this value after each revision.
-                    </xsd:documentation>
-          </xsd:annotation>
-        </xsd:element>
-        <xsd:element name="lastModifiedBy" minOccurs="0" maxOccurs="1" type="xsd:string"/>
-        <xsd:element ref="dcterms:modified" minOccurs="0" maxOccurs="1"/>
-        <xsd:element name="contentStatus" minOccurs="0" maxOccurs="1" type="xsd:string"/>
-      </xsd:all>
-    </xsd:complexType>
-  </xsd:schema>
-  <xs:schema xmlns:pc="http://schemas.microsoft.com/office/infopath/2007/PartnerControls" xmlns:xs="http://www.w3.org/2001/XMLSchema" targetNamespace="http://schemas.microsoft.com/office/infopath/2007/PartnerControls" elementFormDefault="qualified" attributeFormDefault="unqualified">
-    <xs:element name="Person">
-      <xs:complexType>
-        <xs:sequence>
-          <xs:element ref="pc:DisplayName" minOccurs="0"/>
-          <xs:element ref="pc:AccountId" minOccurs="0"/>
-          <xs:element ref="pc:AccountType" minOccurs="0"/>
-        </xs:sequence>
-      </xs:complexType>
-    </xs:element>
-    <xs:element name="DisplayName" type="xs:string"/>
-    <xs:element name="AccountId" type="xs:string"/>
-    <xs:element name="AccountType" type="xs:string"/>
-    <xs:element name="BDCAssociatedEntity">
-      <xs:complexType>
-        <xs:sequence>
-          <xs:element ref="pc:BDCEntity" minOccurs="0" maxOccurs="unbounded"/>
-        </xs:sequence>
-        <xs:attribute ref="pc:EntityNamespace"/>
-        <xs:attribute ref="pc:EntityName"/>
-        <xs:attribute ref="pc:SystemInstanceName"/>
-        <xs:attribute ref="pc:AssociationName"/>
-      </xs:complexType>
-    </xs:element>
-    <xs:attribute name="EntityNamespace" type="xs:string"/>
-    <xs:attribute name="EntityName" type="xs:string"/>
-    <xs:attribute name="SystemInstanceName" type="xs:string"/>
-    <xs:attribute name="AssociationName" type="xs:string"/>
-    <xs:element name="BDCEntity">
-      <xs:complexType>
-        <xs:sequence>
-          <xs:element ref="pc:EntityDisplayName" minOccurs="0"/>
-          <xs:element ref="pc:EntityInstanceReference" minOccurs="0"/>
-          <xs:element ref="pc:EntityId1" minOccurs="0"/>
-          <xs:element ref="pc:EntityId2" minOccurs="0"/>
-          <xs:element ref="pc:EntityId3" minOccurs="0"/>
-          <xs:element ref="pc:EntityId4" minOccurs="0"/>
-          <xs:element ref="pc:EntityId5" minOccurs="0"/>
-        </xs:sequence>
-      </xs:complexType>
-    </xs:element>
-    <xs:element name="EntityDisplayName" type="xs:string"/>
-    <xs:element name="EntityInstanceReference" type="xs:string"/>
-    <xs:element name="EntityId1" type="xs:string"/>
-    <xs:element name="EntityId2" type="xs:string"/>
-    <xs:element name="EntityId3" type="xs:string"/>
-    <xs:element name="EntityId4" type="xs:string"/>
-    <xs:element name="EntityId5" type="xs:string"/>
-    <xs:element name="Terms">
-      <xs:complexType>
-        <xs:sequence>
-          <xs:element ref="pc:TermInfo" minOccurs="0" maxOccurs="unbounded"/>
-        </xs:sequence>
-      </xs:complexType>
-    </xs:element>
-    <xs:element name="TermInfo">
-      <xs:complexType>
-        <xs:sequence>
-          <xs:element ref="pc:TermName" minOccurs="0"/>
-          <xs:element ref="pc:TermId" minOccurs="0"/>
-        </xs:sequence>
-      </xs:complexType>
-    </xs:element>
-    <xs:element name="TermName" type="xs:string"/>
-    <xs:element name="TermId" type="xs:string"/>
-  </xs:schema>
-</ct:contentTypeSchema>
-</file>
-
-<file path=customXml/itemProps1.xml><?xml version="1.0" encoding="utf-8"?>
-<ds:datastoreItem xmlns:ds="http://schemas.openxmlformats.org/officeDocument/2006/customXml" ds:itemID="{58D8DE95-DF74-49C6-8885-90B115E8F94F}">
-  <ds:schemaRefs>
-    <ds:schemaRef ds:uri="http://schemas.microsoft.com/sharepoint/v3/contenttype/forms"/>
-  </ds:schemaRefs>
-</ds:datastoreItem>
-</file>
-
-<file path=customXml/itemProps2.xml><?xml version="1.0" encoding="utf-8"?>
-<ds:datastoreItem xmlns:ds="http://schemas.openxmlformats.org/officeDocument/2006/customXml" ds:itemID="{DEB73F9D-F662-47F0-B1B4-CC4EDF51573A}">
-  <ds:schemaRefs>
-    <ds:schemaRef ds:uri="http://schemas.openxmlformats.org/officeDocument/2006/bibliography"/>
-  </ds:schemaRefs>
-</ds:datastoreItem>
-</file>
-
-<file path=customXml/itemProps3.xml><?xml version="1.0" encoding="utf-8"?>
-<ds:datastoreItem xmlns:ds="http://schemas.openxmlformats.org/officeDocument/2006/customXml" ds:itemID="{C39D5494-1847-4215-BB00-A838605872D2}">
-  <ds:schemaRefs>
-    <ds:schemaRef ds:uri="http://schemas.microsoft.com/office/2006/metadata/properties"/>
-    <ds:schemaRef ds:uri="http://schemas.microsoft.com/office/infopath/2007/PartnerControls"/>
-    <ds:schemaRef ds:uri="d0daa353-f819-43d1-badf-ce69fea8800d"/>
-    <ds:schemaRef ds:uri="edc1eb1c-f9b5-429a-a0ce-702847a0aa2d"/>
-  </ds:schemaRefs>
-</ds:datastoreItem>
-</file>
-
-<file path=customXml/itemProps4.xml><?xml version="1.0" encoding="utf-8"?>
-<ds:datastoreItem xmlns:ds="http://schemas.openxmlformats.org/officeDocument/2006/customXml" ds:itemID="{DCD4F2C9-DDF9-46DF-9B15-9F8705E9936B}">
-  <ds:schemaRefs>
-    <ds:schemaRef ds:uri="http://schemas.microsoft.com/office/2006/metadata/contentType"/>
-    <ds:schemaRef ds:uri="http://schemas.microsoft.com/office/2006/metadata/properties/metaAttributes"/>
-    <ds:schemaRef ds:uri="http://www.w3.org/2001/XMLSchema"/>
-    <ds:schemaRef ds:uri="http://schemas.microsoft.com/office/2006/metadata/properties"/>
-    <ds:schemaRef ds:uri="d0daa353-f819-43d1-badf-ce69fea8800d"/>
-    <ds:schemaRef ds:uri="edc1eb1c-f9b5-429a-a0ce-702847a0aa2d"/>
-    <ds:schemaRef ds:uri="http://schemas.microsoft.com/office/2006/documentManagement/types"/>
-    <ds:schemaRef ds:uri="http://schemas.microsoft.com/office/infopath/2007/PartnerControls"/>
-    <ds:schemaRef ds:uri="http://schemas.openxmlformats.org/package/2006/metadata/core-properties"/>
-    <ds:schemaRef ds:uri="http://purl.org/dc/elements/1.1/"/>
-    <ds:schemaRef ds:uri="http://purl.org/dc/terms/"/>
-    <ds:schemaRef ds:uri="http://schemas.microsoft.com/internal/obd"/>
-  </ds:schemaRefs>
-</ds:datastoreItem>
+<file path=word\webSettings.xml><?xml version="1.0" encoding="utf-8"?>
+<w:webSettings xmlns:mc="http://schemas.openxmlformats.org/markup-compatibility/2006" xmlns:r="http://schemas.openxmlformats.org/officeDocument/2006/relationships" xmlns:w="http://schemas.openxmlformats.org/wordprocessingml/2006/main" xmlns:w14="http://schemas.microsoft.com/office/word/2010/wordml" xmlns:w15="http://schemas.microsoft.com/office/word/2012/wordml" xmlns:w16cex="http://schemas.microsoft.com/office/word/2018/wordml/cex" xmlns:w16cid="http://schemas.microsoft.com/office/word/2016/wordml/cid" xmlns:w16="http://schemas.microsoft.com/office/word/2018/wordml" xmlns:w16du="http://schemas.microsoft.com/office/word/2023/wordml/word16du" xmlns:w16sdtdh="http://schemas.microsoft.com/office/word/2020/wordml/sdtdatahash" xmlns:w16sdtfl="http://schemas.microsoft.com/office/word/2024/wordml/sdtformatlock" xmlns:w16se="http://schemas.microsoft.com/office/word/2015/wordml/symex" mc:Ignorable="w14 w15 w16se w16cid w16 w16cex w16sdtdh w16sdtfl w16du">
+  <w:optimizeForBrowser/>
+  <w:relyOnVML/>
+  <w:allowPNG/>
+</w:webSettings>
 </file>
</xml_diff>